<commit_message>
Create Questions for Assignment 7
</commit_message>
<xml_diff>
--- a/DTSC-540_Intro_to_AI/Assignment_module7.docx
+++ b/DTSC-540_Intro_to_AI/Assignment_module7.docx
@@ -21,9 +21,6 @@
         <w:jc w:val="center"/>
       </w:pPr>
       <w:r>
-        <w:br/>
-      </w:r>
-      <w:r>
         <w:t xml:space="preserve">Module </w:t>
       </w:r>
       <w:r>
@@ -64,244 +61,330 @@
     </w:p>
     <w:p>
       <w:pPr>
-        <w:numPr>
-          <w:ilvl w:val="0"/>
-          <w:numId w:val="11"/>
-        </w:numPr>
-        <w:spacing w:before="240" w:after="0" w:line="240" w:lineRule="auto"/>
+        <w:spacing w:after="0" w:line="240" w:lineRule="auto"/>
         <w:textAlignment w:val="baseline"/>
-        <w:rPr>
-          <w:rFonts w:ascii="Arial" w:eastAsia="Times New Roman" w:hAnsi="Arial" w:cs="Arial"/>
-          <w:color w:val="000000"/>
-          <w:kern w:val="0"/>
-          <w14:ligatures w14:val="none"/>
-        </w:rPr>
-      </w:pPr>
-      <w:r>
-        <w:rPr>
-          <w:rFonts w:ascii="Arial" w:eastAsia="Times New Roman" w:hAnsi="Arial" w:cs="Arial"/>
+      </w:pPr>
+    </w:p>
+    <w:p>
+      <w:r>
+        <w:rPr>
           <w:b/>
           <w:bCs/>
-          <w:color w:val="000000"/>
-          <w:kern w:val="0"/>
-          <w14:ligatures w14:val="none"/>
-        </w:rPr>
-        <w:t xml:space="preserve">Task: </w:t>
-      </w:r>
-      <w:r>
-        <w:rPr>
-          <w:rFonts w:ascii="Arial" w:eastAsia="Times New Roman" w:hAnsi="Arial" w:cs="Arial"/>
-          <w:color w:val="000000"/>
-          <w:kern w:val="0"/>
-          <w14:ligatures w14:val="none"/>
-        </w:rPr>
-        <w:t xml:space="preserve">Generate questions about faith and spirituality that genuinely interest you. Take time to reflect on some of the deeper questions you have or have had, whether those are specific theological questions or broader philosophical questions. </w:t>
-      </w:r>
-      <w:r>
-        <w:rPr>
-          <w:rFonts w:ascii="Arial" w:eastAsia="Times New Roman" w:hAnsi="Arial" w:cs="Arial"/>
-          <w:color w:val="000000"/>
-          <w:kern w:val="0"/>
-          <w14:ligatures w14:val="none"/>
-        </w:rPr>
-        <w:br/>
-      </w:r>
-      <w:r>
-        <w:rPr>
-          <w:rFonts w:ascii="Arial" w:eastAsia="Times New Roman" w:hAnsi="Arial" w:cs="Arial"/>
-          <w:color w:val="000000"/>
-          <w:kern w:val="0"/>
-          <w14:ligatures w14:val="none"/>
-        </w:rPr>
-        <w:br/>
+        </w:rPr>
+        <w:t xml:space="preserve">Question 1 </w:t>
+      </w:r>
+      <w:r>
+        <w:rPr>
+          <w:b/>
+          <w:bCs/>
+        </w:rPr>
+        <w:t xml:space="preserve">- </w:t>
+      </w:r>
+      <w:r>
+        <w:t>Prompt Engineering Technique: Chain of Thought</w:t>
       </w:r>
     </w:p>
     <w:p>
-      <w:pPr>
-        <w:numPr>
-          <w:ilvl w:val="1"/>
-          <w:numId w:val="11"/>
-        </w:numPr>
-        <w:spacing w:after="0" w:line="240" w:lineRule="auto"/>
-        <w:textAlignment w:val="baseline"/>
-        <w:rPr>
-          <w:rFonts w:ascii="Arial" w:eastAsia="Times New Roman" w:hAnsi="Arial" w:cs="Arial"/>
-          <w:color w:val="000000"/>
-          <w:kern w:val="0"/>
-          <w14:ligatures w14:val="none"/>
-        </w:rPr>
-      </w:pPr>
-      <w:r>
-        <w:rPr>
-          <w:rFonts w:ascii="Arial" w:eastAsia="Times New Roman" w:hAnsi="Arial" w:cs="Arial"/>
-          <w:color w:val="000000"/>
-          <w:kern w:val="0"/>
-          <w14:ligatures w14:val="none"/>
-        </w:rPr>
-        <w:t xml:space="preserve">Create </w:t>
-      </w:r>
-      <w:r>
-        <w:rPr>
-          <w:rFonts w:ascii="Arial" w:eastAsia="Times New Roman" w:hAnsi="Arial" w:cs="Arial"/>
+      <w:r>
+        <w:t xml:space="preserve">Answer as if you do </w:t>
+      </w:r>
+      <w:r>
+        <w:t xml:space="preserve">not have a religious background.  Outside of religious tradition, do </w:t>
+      </w:r>
+      <w:r>
+        <w:t xml:space="preserve">you </w:t>
+      </w:r>
+      <w:r>
+        <w:t xml:space="preserve">believe there is evidence that </w:t>
+      </w:r>
+      <w:r>
+        <w:t xml:space="preserve">life on Earth </w:t>
+      </w:r>
+      <w:r>
+        <w:t xml:space="preserve">came to be because of </w:t>
+      </w:r>
+      <w:r>
+        <w:t xml:space="preserve">a Creator? </w:t>
+      </w:r>
+      <w:r>
+        <w:t>How would your answer change if you answered from the perspective of a person with a religious background</w:t>
+      </w:r>
+      <w:r>
+        <w:t xml:space="preserve">? </w:t>
+      </w:r>
+      <w:r>
+        <w:br/>
+      </w:r>
+    </w:p>
+    <w:p>
+      <w:r>
+        <w:rPr>
           <w:b/>
           <w:bCs/>
-          <w:color w:val="000000"/>
-          <w:kern w:val="0"/>
-          <w14:ligatures w14:val="none"/>
-        </w:rPr>
-        <w:t>5 questions</w:t>
-      </w:r>
-      <w:r>
-        <w:rPr>
-          <w:rFonts w:ascii="Arial" w:eastAsia="Times New Roman" w:hAnsi="Arial" w:cs="Arial"/>
-          <w:color w:val="000000"/>
-          <w:kern w:val="0"/>
-          <w14:ligatures w14:val="none"/>
-        </w:rPr>
-        <w:t xml:space="preserve"> using </w:t>
-      </w:r>
-      <w:r>
-        <w:rPr>
-          <w:rFonts w:ascii="Arial" w:eastAsia="Times New Roman" w:hAnsi="Arial" w:cs="Arial"/>
+        </w:rPr>
+        <w:t xml:space="preserve">Question </w:t>
+      </w:r>
+      <w:r>
+        <w:rPr>
           <w:b/>
           <w:bCs/>
-          <w:color w:val="000000"/>
-          <w:kern w:val="0"/>
-          <w14:ligatures w14:val="none"/>
-        </w:rPr>
-        <w:t>prompt engineering techniques</w:t>
-      </w:r>
-      <w:r>
-        <w:rPr>
-          <w:rFonts w:ascii="Arial" w:eastAsia="Times New Roman" w:hAnsi="Arial" w:cs="Arial"/>
-          <w:color w:val="000000"/>
-          <w:kern w:val="0"/>
-          <w14:ligatures w14:val="none"/>
-        </w:rPr>
-        <w:t xml:space="preserve"> from Module 5 to ensure both humans and LLMs can answer meaningfully. Name the prompt engineering technique you used for each question. </w:t>
-      </w:r>
-      <w:r>
-        <w:rPr>
-          <w:rFonts w:ascii="Arial" w:eastAsia="Times New Roman" w:hAnsi="Arial" w:cs="Arial"/>
-          <w:color w:val="000000"/>
-          <w:kern w:val="0"/>
-          <w14:ligatures w14:val="none"/>
-        </w:rPr>
-        <w:br/>
-      </w:r>
-      <w:r>
-        <w:rPr>
-          <w:rFonts w:ascii="Arial" w:eastAsia="Times New Roman" w:hAnsi="Arial" w:cs="Arial"/>
-          <w:color w:val="000000"/>
-          <w:kern w:val="0"/>
-          <w14:ligatures w14:val="none"/>
-        </w:rPr>
-        <w:br/>
+        </w:rPr>
+        <w:t>2</w:t>
+      </w:r>
+      <w:r>
+        <w:rPr>
+          <w:b/>
+          <w:bCs/>
+        </w:rPr>
+        <w:t xml:space="preserve"> -</w:t>
+      </w:r>
+      <w:r>
+        <w:t xml:space="preserve"> </w:t>
+      </w:r>
+      <w:r>
+        <w:t>Prompt Engineering Technique: Few Shot</w:t>
       </w:r>
     </w:p>
     <w:p>
-      <w:pPr>
-        <w:numPr>
-          <w:ilvl w:val="1"/>
-          <w:numId w:val="11"/>
-        </w:numPr>
-        <w:spacing w:after="0" w:line="240" w:lineRule="auto"/>
-        <w:textAlignment w:val="baseline"/>
-        <w:rPr>
-          <w:rFonts w:ascii="Arial" w:eastAsia="Times New Roman" w:hAnsi="Arial" w:cs="Arial"/>
-          <w:color w:val="000000"/>
-          <w:kern w:val="0"/>
-          <w14:ligatures w14:val="none"/>
-        </w:rPr>
-      </w:pPr>
-      <w:r>
-        <w:rPr>
-          <w:rFonts w:ascii="Arial" w:eastAsia="Times New Roman" w:hAnsi="Arial" w:cs="Arial"/>
+      <w:r>
+        <w:t>Answer as if you</w:t>
+      </w:r>
+      <w:r>
+        <w:t xml:space="preserve"> </w:t>
+      </w:r>
+      <w:r>
+        <w:t>have a religious background.</w:t>
+      </w:r>
+      <w:r>
+        <w:t xml:space="preserve"> </w:t>
+      </w:r>
+      <w:r>
+        <w:t>What does it mean to have faith in God? How does a person know if they have faith?</w:t>
+      </w:r>
+      <w:r>
+        <w:t xml:space="preserve"> </w:t>
+      </w:r>
+      <w:r>
+        <w:t xml:space="preserve">Explain why </w:t>
+      </w:r>
+      <w:r>
+        <w:t xml:space="preserve">AI </w:t>
+      </w:r>
+      <w:r>
+        <w:t xml:space="preserve">can or cannot </w:t>
+      </w:r>
+      <w:r>
+        <w:t xml:space="preserve">have faith? </w:t>
+      </w:r>
+    </w:p>
+    <w:p>
+      <w:r>
+        <w:br/>
+      </w:r>
+      <w:r>
+        <w:rPr>
           <w:b/>
           <w:bCs/>
-          <w:color w:val="000000"/>
-          <w:kern w:val="0"/>
-          <w14:ligatures w14:val="none"/>
-        </w:rPr>
-        <w:t>Example starter questions:</w:t>
+        </w:rPr>
+        <w:t xml:space="preserve">Question </w:t>
+      </w:r>
+      <w:r>
+        <w:rPr>
+          <w:b/>
+          <w:bCs/>
+        </w:rPr>
+        <w:t>3</w:t>
+      </w:r>
+      <w:r>
+        <w:rPr>
+          <w:b/>
+          <w:bCs/>
+        </w:rPr>
+        <w:t xml:space="preserve"> </w:t>
+      </w:r>
+      <w:r>
+        <w:rPr>
+          <w:b/>
+          <w:bCs/>
+        </w:rPr>
+        <w:t xml:space="preserve">- </w:t>
+      </w:r>
+      <w:r>
+        <w:t>Prompt Engineering Technique: Zero Shot</w:t>
       </w:r>
     </w:p>
     <w:p>
-      <w:pPr>
-        <w:numPr>
-          <w:ilvl w:val="2"/>
-          <w:numId w:val="11"/>
-        </w:numPr>
-        <w:spacing w:after="0" w:line="240" w:lineRule="auto"/>
-        <w:textAlignment w:val="baseline"/>
-        <w:rPr>
-          <w:rFonts w:ascii="Arial" w:eastAsia="Times New Roman" w:hAnsi="Arial" w:cs="Arial"/>
-          <w:color w:val="000000"/>
-          <w:kern w:val="0"/>
-          <w14:ligatures w14:val="none"/>
-        </w:rPr>
-      </w:pPr>
-      <w:r>
-        <w:rPr>
-          <w:rFonts w:ascii="Arial" w:eastAsia="Times New Roman" w:hAnsi="Arial" w:cs="Arial"/>
-          <w:color w:val="000000"/>
-          <w:kern w:val="0"/>
-          <w14:ligatures w14:val="none"/>
-        </w:rPr>
-        <w:t>What does it mean to have a “soul” or “spirit”? Could AIs ever have either?</w:t>
+      <w:r>
+        <w:t xml:space="preserve">Answer as if you </w:t>
+      </w:r>
+      <w:r>
+        <w:t xml:space="preserve">were a secular historian who studies </w:t>
+      </w:r>
+      <w:r>
+        <w:t>religio</w:t>
+      </w:r>
+      <w:r>
+        <w:t>n</w:t>
+      </w:r>
+      <w:r>
+        <w:t>s</w:t>
+      </w:r>
+      <w:r>
+        <w:t xml:space="preserve">. </w:t>
+      </w:r>
+      <w:r>
+        <w:t>Why do you think there are so many different religions?</w:t>
+      </w:r>
+      <w:r>
+        <w:t xml:space="preserve"> </w:t>
       </w:r>
     </w:p>
     <w:p>
-      <w:pPr>
-        <w:numPr>
-          <w:ilvl w:val="2"/>
-          <w:numId w:val="11"/>
-        </w:numPr>
-        <w:spacing w:after="0" w:line="240" w:lineRule="auto"/>
-        <w:textAlignment w:val="baseline"/>
-        <w:rPr>
-          <w:rFonts w:ascii="Arial" w:eastAsia="Times New Roman" w:hAnsi="Arial" w:cs="Arial"/>
-          <w:color w:val="000000"/>
-          <w:kern w:val="0"/>
-          <w14:ligatures w14:val="none"/>
-        </w:rPr>
-      </w:pPr>
-      <w:r>
-        <w:rPr>
-          <w:rFonts w:ascii="Arial" w:eastAsia="Times New Roman" w:hAnsi="Arial" w:cs="Arial"/>
-          <w:color w:val="000000"/>
-          <w:kern w:val="0"/>
-          <w14:ligatures w14:val="none"/>
-        </w:rPr>
-        <w:t>How does the Imago Dei influence humans' view of creativity and work?</w:t>
+      <w:r>
+        <w:br/>
+      </w:r>
+      <w:r>
+        <w:rPr>
+          <w:b/>
+          <w:bCs/>
+        </w:rPr>
+        <w:t xml:space="preserve">Question </w:t>
+      </w:r>
+      <w:r>
+        <w:rPr>
+          <w:b/>
+          <w:bCs/>
+        </w:rPr>
+        <w:t>4</w:t>
+      </w:r>
+      <w:r>
+        <w:rPr>
+          <w:b/>
+          <w:bCs/>
+        </w:rPr>
+        <w:t xml:space="preserve"> – </w:t>
+      </w:r>
+      <w:r>
+        <w:t>Prompt Engineering Technique: Zero Shot</w:t>
+      </w:r>
+      <w:r>
+        <w:br/>
+      </w:r>
+      <w:r>
+        <w:br/>
+        <w:t>Answer as if you were a person of faith. Why does God let bad things happen to good people?</w:t>
       </w:r>
     </w:p>
     <w:p>
-      <w:pPr>
-        <w:numPr>
-          <w:ilvl w:val="2"/>
-          <w:numId w:val="11"/>
-        </w:numPr>
-        <w:spacing w:after="0" w:line="240" w:lineRule="auto"/>
-        <w:textAlignment w:val="baseline"/>
-        <w:rPr>
-          <w:rFonts w:ascii="Arial" w:eastAsia="Times New Roman" w:hAnsi="Arial" w:cs="Arial"/>
-          <w:color w:val="000000"/>
-          <w:kern w:val="0"/>
-          <w14:ligatures w14:val="none"/>
-        </w:rPr>
-      </w:pPr>
-      <w:r>
-        <w:rPr>
-          <w:rFonts w:ascii="Arial" w:eastAsia="Times New Roman" w:hAnsi="Arial" w:cs="Arial"/>
-          <w:color w:val="000000"/>
-          <w:kern w:val="0"/>
-          <w14:ligatures w14:val="none"/>
-        </w:rPr>
-        <w:t>Can AI ever truly “know” God, or will it forever be limited to simulating religious language?</w:t>
+      <w:r>
+        <w:rPr>
+          <w:b/>
+          <w:bCs/>
+        </w:rPr>
+        <w:br/>
+      </w:r>
+      <w:r>
+        <w:rPr>
+          <w:b/>
+          <w:bCs/>
+        </w:rPr>
+        <w:t xml:space="preserve">Question </w:t>
+      </w:r>
+      <w:r>
+        <w:rPr>
+          <w:b/>
+          <w:bCs/>
+        </w:rPr>
+        <w:t>5</w:t>
+      </w:r>
+      <w:r>
+        <w:rPr>
+          <w:b/>
+          <w:bCs/>
+        </w:rPr>
+        <w:t xml:space="preserve"> - </w:t>
+      </w:r>
+      <w:r>
+        <w:t>Prompt Engineering Technique: Chain of Thought</w:t>
       </w:r>
     </w:p>
-    <w:p/>
+    <w:p>
+      <w:r>
+        <w:t xml:space="preserve">Answer as if you were a </w:t>
+      </w:r>
+      <w:r>
+        <w:t xml:space="preserve">scholar of human behavior. </w:t>
+      </w:r>
+      <w:r>
+        <w:t xml:space="preserve">If </w:t>
+      </w:r>
+      <w:r>
+        <w:t>extraterrestrials</w:t>
+      </w:r>
+      <w:r>
+        <w:t xml:space="preserve"> </w:t>
+      </w:r>
+      <w:r>
+        <w:t>contacted</w:t>
+      </w:r>
+      <w:r>
+        <w:t xml:space="preserve"> </w:t>
+      </w:r>
+      <w:r>
+        <w:t>humans</w:t>
+      </w:r>
+      <w:r>
+        <w:t xml:space="preserve">, do you think humans would start a religion worshipping them.  </w:t>
+      </w:r>
+      <w:r>
+        <w:t>I</w:t>
+      </w:r>
+      <w:r>
+        <w:t xml:space="preserve">f the </w:t>
+      </w:r>
+      <w:r>
+        <w:t>extraterrestrials</w:t>
+      </w:r>
+      <w:r>
+        <w:t xml:space="preserve"> refused to be worshipped and </w:t>
+      </w:r>
+      <w:r>
+        <w:t xml:space="preserve">stated that God had visited them and established a </w:t>
+      </w:r>
+      <w:r>
+        <w:t xml:space="preserve">religion </w:t>
+      </w:r>
+      <w:r>
+        <w:t xml:space="preserve">that </w:t>
+      </w:r>
+      <w:r>
+        <w:t xml:space="preserve">agreed with </w:t>
+      </w:r>
+      <w:r>
+        <w:t xml:space="preserve">only </w:t>
+      </w:r>
+      <w:r>
+        <w:t>one of the religio</w:t>
+      </w:r>
+      <w:r>
+        <w:t>u</w:t>
+      </w:r>
+      <w:r>
+        <w:t xml:space="preserve">s </w:t>
+      </w:r>
+      <w:r>
+        <w:t xml:space="preserve">sects </w:t>
+      </w:r>
+      <w:r>
+        <w:t>on Earth</w:t>
+      </w:r>
+      <w:r>
+        <w:t>,</w:t>
+      </w:r>
+      <w:r>
+        <w:t xml:space="preserve"> what do you think would happen?  </w:t>
+      </w:r>
+    </w:p>
     <w:p>
       <w:pPr>
         <w:pStyle w:val="Heading1"/>
@@ -407,7 +490,17 @@
           <w:kern w:val="0"/>
           <w14:ligatures w14:val="none"/>
         </w:rPr>
-        <w:t xml:space="preserve"> (ask for clarification, push back, explore alternative theological or philosophical positions). Try to </w:t>
+        <w:t xml:space="preserve"> (ask for clarification, push back, explore alternative theological or </w:t>
+      </w:r>
+      <w:r>
+        <w:rPr>
+          <w:rFonts w:ascii="Arial" w:eastAsia="Times New Roman" w:hAnsi="Arial" w:cs="Arial"/>
+          <w:color w:val="000000"/>
+          <w:kern w:val="0"/>
+          <w14:ligatures w14:val="none"/>
+        </w:rPr>
+        <w:lastRenderedPageBreak/>
+        <w:t xml:space="preserve">philosophical positions). Try to </w:t>
       </w:r>
       <w:r>
         <w:rPr>
@@ -633,7 +726,6 @@
         <w:rPr>
           <w:rFonts w:asciiTheme="minorHAnsi" w:hAnsiTheme="minorHAnsi" w:cstheme="minorBidi"/>
         </w:rPr>
-        <w:lastRenderedPageBreak/>
         <w:t xml:space="preserve">Part </w:t>
       </w:r>
       <w:r>
@@ -3260,7 +3352,7 @@
   <w:style w:type="paragraph" w:default="1" w:styleId="Normal">
     <w:name w:val="Normal"/>
     <w:qFormat/>
-    <w:rsid w:val="00282E83"/>
+    <w:rsid w:val="003372B2"/>
   </w:style>
   <w:style w:type="paragraph" w:styleId="Heading1">
     <w:name w:val="heading 1"/>
@@ -3464,7 +3556,6 @@
   <w:style w:type="character" w:default="1" w:styleId="DefaultParagraphFont">
     <w:name w:val="Default Paragraph Font"/>
     <w:uiPriority w:val="1"/>
-    <w:semiHidden/>
     <w:unhideWhenUsed/>
   </w:style>
   <w:style w:type="table" w:default="1" w:styleId="TableNormal">

</xml_diff>

<commit_message>
UPdate Part 1 and 2
</commit_message>
<xml_diff>
--- a/DTSC-540_Intro_to_AI/Assignment_module7.docx
+++ b/DTSC-540_Intro_to_AI/Assignment_module7.docx
@@ -19,23 +19,51 @@
       <w:pPr>
         <w:pStyle w:val="Title"/>
         <w:jc w:val="center"/>
-      </w:pPr>
-      <w:r>
+        <w:rPr>
+          <w:sz w:val="52"/>
+          <w:szCs w:val="52"/>
+        </w:rPr>
+      </w:pPr>
+      <w:r>
+        <w:rPr>
+          <w:sz w:val="52"/>
+          <w:szCs w:val="52"/>
+        </w:rPr>
         <w:t xml:space="preserve">Module </w:t>
       </w:r>
       <w:r>
+        <w:rPr>
+          <w:sz w:val="52"/>
+          <w:szCs w:val="52"/>
+        </w:rPr>
         <w:t>7</w:t>
       </w:r>
       <w:r>
+        <w:rPr>
+          <w:sz w:val="52"/>
+          <w:szCs w:val="52"/>
+        </w:rPr>
         <w:t xml:space="preserve"> Assignment</w:t>
       </w:r>
       <w:r>
+        <w:rPr>
+          <w:sz w:val="52"/>
+          <w:szCs w:val="52"/>
+        </w:rPr>
         <w:br/>
       </w:r>
       <w:r>
+        <w:rPr>
+          <w:sz w:val="52"/>
+          <w:szCs w:val="52"/>
+        </w:rPr>
         <w:t>AI</w:t>
       </w:r>
       <w:r>
+        <w:rPr>
+          <w:sz w:val="52"/>
+          <w:szCs w:val="52"/>
+        </w:rPr>
         <w:t>, Faith, and Humanity</w:t>
       </w:r>
     </w:p>
@@ -89,7 +117,19 @@
         <w:t xml:space="preserve">Answer as if you do </w:t>
       </w:r>
       <w:r>
-        <w:t xml:space="preserve">not have a religious background.  Outside of religious tradition, do </w:t>
+        <w:t xml:space="preserve">not have a religious background.  </w:t>
+      </w:r>
+      <w:r>
+        <w:t xml:space="preserve">Limit your response to </w:t>
+      </w:r>
+      <w:r>
+        <w:t>150</w:t>
+      </w:r>
+      <w:r>
+        <w:t xml:space="preserve"> words. </w:t>
+      </w:r>
+      <w:r>
+        <w:t xml:space="preserve">Outside of religious tradition, do </w:t>
       </w:r>
       <w:r>
         <w:t xml:space="preserve">you </w:t>
@@ -122,430 +162,509 @@
           <w:b/>
           <w:bCs/>
         </w:rPr>
-        <w:t xml:space="preserve">Question </w:t>
+        <w:t>Question 2</w:t>
       </w:r>
       <w:r>
         <w:rPr>
           <w:b/>
           <w:bCs/>
         </w:rPr>
-        <w:t>2</w:t>
+        <w:t xml:space="preserve"> -</w:t>
+      </w:r>
+      <w:r>
+        <w:t xml:space="preserve"> Prompt Engineering Technique: </w:t>
+      </w:r>
+      <w:r>
+        <w:t>Zero</w:t>
+      </w:r>
+      <w:r>
+        <w:t xml:space="preserve"> Shot</w:t>
+      </w:r>
+    </w:p>
+    <w:p>
+      <w:r>
+        <w:t xml:space="preserve">Answer as if you </w:t>
+      </w:r>
+      <w:r>
+        <w:t xml:space="preserve">have a religious background. </w:t>
+      </w:r>
+      <w:r>
+        <w:t xml:space="preserve">Limit your response to </w:t>
+      </w:r>
+      <w:r>
+        <w:t xml:space="preserve">150 </w:t>
+      </w:r>
+      <w:r>
+        <w:t>words.</w:t>
+      </w:r>
+      <w:r>
+        <w:t xml:space="preserve"> </w:t>
+      </w:r>
+      <w:r>
+        <w:t>What does it mean to have faith in God? How does a person know if they have faith?</w:t>
+      </w:r>
+      <w:r>
+        <w:t xml:space="preserve"> </w:t>
+      </w:r>
+      <w:r>
+        <w:t xml:space="preserve">Explain why </w:t>
+      </w:r>
+      <w:r>
+        <w:t xml:space="preserve">AI </w:t>
+      </w:r>
+      <w:r>
+        <w:t xml:space="preserve">can or cannot </w:t>
+      </w:r>
+      <w:r>
+        <w:t xml:space="preserve">have faith? </w:t>
+      </w:r>
+    </w:p>
+    <w:p>
+      <w:r>
+        <w:br/>
       </w:r>
       <w:r>
         <w:rPr>
           <w:b/>
           <w:bCs/>
         </w:rPr>
-        <w:t xml:space="preserve"> -</w:t>
-      </w:r>
-      <w:r>
-        <w:t xml:space="preserve"> </w:t>
-      </w:r>
-      <w:r>
-        <w:t>Prompt Engineering Technique: Few Shot</w:t>
-      </w:r>
-    </w:p>
-    <w:p>
-      <w:r>
-        <w:t>Answer as if you</w:t>
-      </w:r>
-      <w:r>
-        <w:t xml:space="preserve"> </w:t>
-      </w:r>
-      <w:r>
-        <w:t>have a religious background.</w:t>
-      </w:r>
-      <w:r>
-        <w:t xml:space="preserve"> </w:t>
-      </w:r>
-      <w:r>
-        <w:t>What does it mean to have faith in God? How does a person know if they have faith?</w:t>
-      </w:r>
-      <w:r>
-        <w:t xml:space="preserve"> </w:t>
-      </w:r>
-      <w:r>
-        <w:t xml:space="preserve">Explain why </w:t>
-      </w:r>
-      <w:r>
-        <w:t xml:space="preserve">AI </w:t>
-      </w:r>
-      <w:r>
-        <w:t xml:space="preserve">can or cannot </w:t>
-      </w:r>
-      <w:r>
-        <w:t xml:space="preserve">have faith? </w:t>
-      </w:r>
-    </w:p>
-    <w:p>
-      <w:r>
-        <w:br/>
+        <w:t>Question 3</w:t>
       </w:r>
       <w:r>
         <w:rPr>
           <w:b/>
           <w:bCs/>
         </w:rPr>
-        <w:t xml:space="preserve">Question </w:t>
+        <w:t xml:space="preserve"> </w:t>
       </w:r>
       <w:r>
         <w:rPr>
           <w:b/>
           <w:bCs/>
         </w:rPr>
-        <w:t>3</w:t>
+        <w:t xml:space="preserve">- </w:t>
+      </w:r>
+      <w:r>
+        <w:t>Prompt Engineering Technique: Zero Shot</w:t>
+      </w:r>
+    </w:p>
+    <w:p>
+      <w:r>
+        <w:t xml:space="preserve">Answer as if you were a secular historian who studies religions. </w:t>
+      </w:r>
+      <w:r>
+        <w:t xml:space="preserve">Limit your response to </w:t>
+      </w:r>
+      <w:r>
+        <w:t xml:space="preserve">150 </w:t>
+      </w:r>
+      <w:r>
+        <w:t>words.</w:t>
+      </w:r>
+      <w:r>
+        <w:t xml:space="preserve"> </w:t>
+      </w:r>
+      <w:r>
+        <w:t>Why do you think there are so many different religions?</w:t>
+      </w:r>
+      <w:r>
+        <w:t xml:space="preserve"> </w:t>
+      </w:r>
+    </w:p>
+    <w:p>
+      <w:r>
+        <w:br/>
       </w:r>
       <w:r>
         <w:rPr>
           <w:b/>
           <w:bCs/>
         </w:rPr>
-        <w:t xml:space="preserve"> </w:t>
+        <w:t>Question 4</w:t>
       </w:r>
       <w:r>
         <w:rPr>
           <w:b/>
           <w:bCs/>
         </w:rPr>
-        <w:t xml:space="preserve">- </w:t>
+        <w:t xml:space="preserve"> – </w:t>
       </w:r>
       <w:r>
         <w:t>Prompt Engineering Technique: Zero Shot</w:t>
       </w:r>
-    </w:p>
-    <w:p>
-      <w:r>
-        <w:t xml:space="preserve">Answer as if you </w:t>
-      </w:r>
-      <w:r>
-        <w:t xml:space="preserve">were a secular historian who studies </w:t>
-      </w:r>
-      <w:r>
-        <w:t>religio</w:t>
-      </w:r>
-      <w:r>
-        <w:t>n</w:t>
-      </w:r>
-      <w:r>
-        <w:t>s</w:t>
-      </w:r>
-      <w:r>
-        <w:t xml:space="preserve">. </w:t>
-      </w:r>
-      <w:r>
-        <w:t>Why do you think there are so many different religions?</w:t>
+      <w:r>
+        <w:br/>
+      </w:r>
+      <w:r>
+        <w:br/>
+        <w:t>Answer as if you were a person of faith.</w:t>
       </w:r>
       <w:r>
         <w:t xml:space="preserve"> </w:t>
       </w:r>
-    </w:p>
-    <w:p>
+      <w:r>
+        <w:t xml:space="preserve">Limit your response to </w:t>
+      </w:r>
+      <w:r>
+        <w:t xml:space="preserve">150 </w:t>
+      </w:r>
+      <w:r>
+        <w:t>words.</w:t>
+      </w:r>
+      <w:r>
+        <w:t xml:space="preserve"> </w:t>
+      </w:r>
+      <w:r>
+        <w:t>Why does God let bad things happen to good people?</w:t>
+      </w:r>
       <w:r>
         <w:br/>
       </w:r>
+      <w:r>
+        <w:br/>
+        <w:t xml:space="preserve">Pushback:  </w:t>
+      </w:r>
+      <w:r>
+        <w:t>Why won't God remove such tragedies as flood, famine, earthquake, etc</w:t>
+      </w:r>
+      <w:r>
+        <w:t>.</w:t>
+      </w:r>
+      <w:r>
+        <w:t>?</w:t>
+      </w:r>
+      <w:r>
+        <w:t xml:space="preserve"> Limit response to 100 words</w:t>
+      </w:r>
+    </w:p>
+    <w:p>
       <w:r>
         <w:rPr>
           <w:b/>
           <w:bCs/>
         </w:rPr>
-        <w:t xml:space="preserve">Question </w:t>
+        <w:br/>
       </w:r>
       <w:r>
         <w:rPr>
           <w:b/>
           <w:bCs/>
         </w:rPr>
-        <w:t>4</w:t>
+        <w:t xml:space="preserve">Question </w:t>
       </w:r>
       <w:r>
         <w:rPr>
           <w:b/>
           <w:bCs/>
         </w:rPr>
-        <w:t xml:space="preserve"> – </w:t>
-      </w:r>
-      <w:r>
-        <w:t>Prompt Engineering Technique: Zero Shot</w:t>
-      </w:r>
-      <w:r>
-        <w:br/>
-      </w:r>
-      <w:r>
-        <w:br/>
-        <w:t>Answer as if you were a person of faith. Why does God let bad things happen to good people?</w:t>
-      </w:r>
-    </w:p>
-    <w:p>
+        <w:t>5</w:t>
+      </w:r>
       <w:r>
         <w:rPr>
           <w:b/>
           <w:bCs/>
         </w:rPr>
+        <w:t xml:space="preserve"> - </w:t>
+      </w:r>
+      <w:r>
+        <w:t>Prompt Engineering Technique: Chain of Thought</w:t>
+      </w:r>
+    </w:p>
+    <w:p>
+      <w:r>
+        <w:t xml:space="preserve">Answer as if you were a </w:t>
+      </w:r>
+      <w:r>
+        <w:t>person of faith</w:t>
+      </w:r>
+      <w:r>
+        <w:t xml:space="preserve">. </w:t>
+      </w:r>
+      <w:r>
+        <w:t xml:space="preserve">Limit your response to </w:t>
+      </w:r>
+      <w:r>
+        <w:t>200</w:t>
+      </w:r>
+      <w:r>
+        <w:t xml:space="preserve"> </w:t>
+      </w:r>
+      <w:r>
+        <w:t>words.</w:t>
+      </w:r>
+      <w:r>
+        <w:t xml:space="preserve"> </w:t>
+      </w:r>
+      <w:r>
+        <w:t xml:space="preserve">If </w:t>
+      </w:r>
+      <w:r>
+        <w:t xml:space="preserve">extraterrestrials </w:t>
+      </w:r>
+      <w:r>
+        <w:t>contacted</w:t>
+      </w:r>
+      <w:r>
+        <w:t xml:space="preserve"> </w:t>
+      </w:r>
+      <w:r>
+        <w:t>humans</w:t>
+      </w:r>
+      <w:r>
+        <w:t>, do you think humans would start a religion worshipping them</w:t>
+      </w:r>
+      <w:r>
+        <w:t>?</w:t>
+      </w:r>
+      <w:r>
+        <w:t xml:space="preserve">  </w:t>
+      </w:r>
+      <w:r>
+        <w:t>I</w:t>
+      </w:r>
+      <w:r>
+        <w:t xml:space="preserve">f the extraterrestrials </w:t>
+      </w:r>
+      <w:r>
+        <w:t xml:space="preserve">stated that God had visited them and established a </w:t>
+      </w:r>
+      <w:r>
+        <w:t xml:space="preserve">religion </w:t>
+      </w:r>
+      <w:r>
+        <w:t xml:space="preserve">that </w:t>
+      </w:r>
+      <w:r>
+        <w:t xml:space="preserve">agreed with </w:t>
+      </w:r>
+      <w:r>
+        <w:t xml:space="preserve">only </w:t>
+      </w:r>
+      <w:r>
+        <w:t>one of the religio</w:t>
+      </w:r>
+      <w:r>
+        <w:t>u</w:t>
+      </w:r>
+      <w:r>
+        <w:t xml:space="preserve">s </w:t>
+      </w:r>
+      <w:r>
+        <w:t xml:space="preserve">sects </w:t>
+      </w:r>
+      <w:r>
+        <w:t>on Earth</w:t>
+      </w:r>
+      <w:r>
+        <w:t>,</w:t>
+      </w:r>
+      <w:r>
+        <w:t xml:space="preserve"> what do you think would </w:t>
+      </w:r>
+      <w:r>
+        <w:t>be the response from the perspective of an adherent of that faith, a non-religious person, and a devoted adherent of another faith</w:t>
+      </w:r>
+      <w:r>
+        <w:t xml:space="preserve">?  </w:t>
+      </w:r>
+      <w:r>
+        <w:t>Show your reasoning for each.</w:t>
+      </w:r>
+    </w:p>
+    <w:p>
+      <w:pPr>
+        <w:pStyle w:val="Heading1"/>
+        <w:rPr>
+          <w:rFonts w:asciiTheme="minorHAnsi" w:hAnsiTheme="minorHAnsi" w:cstheme="minorBidi"/>
+        </w:rPr>
+      </w:pPr>
+      <w:r>
+        <w:rPr>
+          <w:rFonts w:asciiTheme="minorHAnsi" w:hAnsiTheme="minorHAnsi" w:cstheme="minorBidi"/>
+        </w:rPr>
+        <w:lastRenderedPageBreak/>
+        <w:t xml:space="preserve">Part </w:t>
+      </w:r>
+      <w:r>
+        <w:rPr>
+          <w:rFonts w:asciiTheme="minorHAnsi" w:hAnsiTheme="minorHAnsi" w:cstheme="minorBidi"/>
+        </w:rPr>
+        <w:t>2</w:t>
+      </w:r>
+      <w:r>
+        <w:rPr>
+          <w:rFonts w:asciiTheme="minorHAnsi" w:hAnsiTheme="minorHAnsi" w:cstheme="minorBidi"/>
+        </w:rPr>
+        <w:t xml:space="preserve">: </w:t>
+      </w:r>
+      <w:r>
+        <w:rPr>
+          <w:rFonts w:asciiTheme="minorHAnsi" w:hAnsiTheme="minorHAnsi" w:cstheme="minorBidi"/>
+        </w:rPr>
+        <w:t>AI Faith Interview</w:t>
+      </w:r>
+      <w:r>
+        <w:rPr>
+          <w:rFonts w:asciiTheme="minorHAnsi" w:hAnsiTheme="minorHAnsi" w:cstheme="minorBidi"/>
+        </w:rPr>
+        <w:t xml:space="preserve"> Reflection </w:t>
+      </w:r>
+    </w:p>
+    <w:p>
+      <w:pPr>
+        <w:spacing w:before="240" w:after="0" w:line="240" w:lineRule="auto"/>
+        <w:textAlignment w:val="baseline"/>
+        <w:rPr>
+          <w:rFonts w:ascii="Arial" w:eastAsia="Times New Roman" w:hAnsi="Arial" w:cs="Arial"/>
+          <w:color w:val="000000"/>
+          <w:kern w:val="0"/>
+          <w14:ligatures w14:val="none"/>
+        </w:rPr>
+      </w:pPr>
+      <w:r>
+        <w:rPr>
+          <w:rFonts w:ascii="Arial" w:eastAsia="Times New Roman" w:hAnsi="Arial" w:cs="Arial"/>
+          <w:color w:val="000000"/>
+          <w:kern w:val="0"/>
+          <w14:ligatures w14:val="none"/>
+        </w:rPr>
+        <w:t xml:space="preserve">For this task I used </w:t>
+      </w:r>
+      <w:hyperlink r:id="rId5" w:history="1">
+        <w:r>
+          <w:rPr>
+            <w:rStyle w:val="Hyperlink"/>
+            <w:rFonts w:ascii="Arial" w:eastAsia="Times New Roman" w:hAnsi="Arial" w:cs="Arial"/>
+            <w:kern w:val="0"/>
+            <w14:ligatures w14:val="none"/>
+          </w:rPr>
+          <w:t>https://app.chathub.gg/</w:t>
+        </w:r>
+      </w:hyperlink>
+      <w:r>
+        <w:rPr>
+          <w:rFonts w:ascii="Arial" w:eastAsia="Times New Roman" w:hAnsi="Arial" w:cs="Arial"/>
+          <w:color w:val="000000"/>
+          <w:kern w:val="0"/>
+          <w14:ligatures w14:val="none"/>
+        </w:rPr>
+        <w:t xml:space="preserve"> </w:t>
+      </w:r>
+      <w:r>
+        <w:rPr>
+          <w:rFonts w:ascii="Arial" w:eastAsia="Times New Roman" w:hAnsi="Arial" w:cs="Arial"/>
+          <w:color w:val="000000"/>
+          <w:kern w:val="0"/>
+          <w14:ligatures w14:val="none"/>
+        </w:rPr>
+        <w:t xml:space="preserve">which is a tool that allows users to ask multiple AIs the same questions simultaneously. </w:t>
+      </w:r>
+      <w:r>
+        <w:rPr>
+          <w:rFonts w:ascii="Arial" w:eastAsia="Times New Roman" w:hAnsi="Arial" w:cs="Arial"/>
+          <w:color w:val="000000"/>
+          <w:kern w:val="0"/>
+          <w14:ligatures w14:val="none"/>
+        </w:rPr>
+        <w:t>I used GPT-5.6 Luna, Llama 4, and Gemini 3.8 Flash.</w:t>
+      </w:r>
+      <w:r>
+        <w:rPr>
+          <w:rFonts w:ascii="Arial" w:eastAsia="Times New Roman" w:hAnsi="Arial" w:cs="Arial"/>
+          <w:color w:val="000000"/>
+          <w:kern w:val="0"/>
+          <w14:ligatures w14:val="none"/>
+        </w:rPr>
         <w:br/>
       </w:r>
       <w:r>
         <w:rPr>
-          <w:b/>
-          <w:bCs/>
-        </w:rPr>
-        <w:t xml:space="preserve">Question </w:t>
-      </w:r>
-      <w:r>
-        <w:rPr>
-          <w:b/>
-          <w:bCs/>
-        </w:rPr>
-        <w:t>5</w:t>
-      </w:r>
-      <w:r>
-        <w:rPr>
-          <w:b/>
-          <w:bCs/>
-        </w:rPr>
-        <w:t xml:space="preserve"> - </w:t>
-      </w:r>
-      <w:r>
-        <w:t>Prompt Engineering Technique: Chain of Thought</w:t>
-      </w:r>
-    </w:p>
-    <w:p>
-      <w:r>
-        <w:t xml:space="preserve">Answer as if you were a </w:t>
-      </w:r>
-      <w:r>
-        <w:t xml:space="preserve">scholar of human behavior. </w:t>
-      </w:r>
-      <w:r>
-        <w:t xml:space="preserve">If </w:t>
-      </w:r>
-      <w:r>
-        <w:t>extraterrestrials</w:t>
-      </w:r>
-      <w:r>
-        <w:t xml:space="preserve"> </w:t>
-      </w:r>
-      <w:r>
-        <w:t>contacted</w:t>
-      </w:r>
-      <w:r>
-        <w:t xml:space="preserve"> </w:t>
-      </w:r>
-      <w:r>
-        <w:t>humans</w:t>
-      </w:r>
-      <w:r>
-        <w:t xml:space="preserve">, do you think humans would start a religion worshipping them.  </w:t>
-      </w:r>
-      <w:r>
-        <w:t>I</w:t>
-      </w:r>
-      <w:r>
-        <w:t xml:space="preserve">f the </w:t>
-      </w:r>
-      <w:r>
-        <w:t>extraterrestrials</w:t>
-      </w:r>
-      <w:r>
-        <w:t xml:space="preserve"> refused to be worshipped and </w:t>
-      </w:r>
-      <w:r>
-        <w:t xml:space="preserve">stated that God had visited them and established a </w:t>
-      </w:r>
-      <w:r>
-        <w:t xml:space="preserve">religion </w:t>
-      </w:r>
-      <w:r>
-        <w:t xml:space="preserve">that </w:t>
-      </w:r>
-      <w:r>
-        <w:t xml:space="preserve">agreed with </w:t>
-      </w:r>
-      <w:r>
-        <w:t xml:space="preserve">only </w:t>
-      </w:r>
-      <w:r>
-        <w:t>one of the religio</w:t>
-      </w:r>
-      <w:r>
-        <w:t>u</w:t>
-      </w:r>
-      <w:r>
-        <w:t xml:space="preserve">s </w:t>
-      </w:r>
-      <w:r>
-        <w:t xml:space="preserve">sects </w:t>
-      </w:r>
-      <w:r>
-        <w:t>on Earth</w:t>
-      </w:r>
-      <w:r>
-        <w:t>,</w:t>
-      </w:r>
-      <w:r>
-        <w:t xml:space="preserve"> what do you think would happen?  </w:t>
-      </w:r>
-    </w:p>
-    <w:p>
-      <w:pPr>
-        <w:pStyle w:val="Heading1"/>
-        <w:rPr>
-          <w:rFonts w:asciiTheme="minorHAnsi" w:hAnsiTheme="minorHAnsi" w:cstheme="minorBidi"/>
-        </w:rPr>
-      </w:pPr>
-      <w:r>
-        <w:rPr>
-          <w:rFonts w:asciiTheme="minorHAnsi" w:hAnsiTheme="minorHAnsi" w:cstheme="minorBidi"/>
-        </w:rPr>
-        <w:t xml:space="preserve">Part </w:t>
-      </w:r>
-      <w:r>
-        <w:rPr>
-          <w:rFonts w:asciiTheme="minorHAnsi" w:hAnsiTheme="minorHAnsi" w:cstheme="minorBidi"/>
-        </w:rPr>
-        <w:t>2</w:t>
-      </w:r>
-      <w:r>
-        <w:rPr>
-          <w:rFonts w:asciiTheme="minorHAnsi" w:hAnsiTheme="minorHAnsi" w:cstheme="minorBidi"/>
-        </w:rPr>
-        <w:t xml:space="preserve">: </w:t>
-      </w:r>
-      <w:r>
-        <w:rPr>
-          <w:rFonts w:asciiTheme="minorHAnsi" w:hAnsiTheme="minorHAnsi" w:cstheme="minorBidi"/>
-        </w:rPr>
-        <w:t>AI Faith Interview</w:t>
-      </w:r>
-    </w:p>
-    <w:p>
-      <w:pPr>
+          <w:rFonts w:ascii="Arial" w:eastAsia="Times New Roman" w:hAnsi="Arial" w:cs="Arial"/>
+          <w:color w:val="000000"/>
+          <w:kern w:val="0"/>
+          <w14:ligatures w14:val="none"/>
+        </w:rPr>
+        <w:br/>
+      </w:r>
+      <w:r>
+        <w:rPr>
+          <w:rFonts w:ascii="Arial" w:eastAsia="Times New Roman" w:hAnsi="Arial" w:cs="Arial"/>
+          <w:color w:val="000000"/>
+          <w:kern w:val="0"/>
+          <w14:ligatures w14:val="none"/>
+        </w:rPr>
+        <w:t xml:space="preserve">Reflection </w:t>
+      </w:r>
+    </w:p>
+    <w:p>
+      <w:pPr>
+        <w:spacing w:after="0" w:line="240" w:lineRule="auto"/>
+        <w:textAlignment w:val="baseline"/>
+        <w:rPr>
+          <w:rFonts w:ascii="Arial" w:eastAsia="Times New Roman" w:hAnsi="Arial" w:cs="Arial"/>
+          <w:color w:val="000000"/>
+          <w:kern w:val="0"/>
+          <w14:ligatures w14:val="none"/>
+        </w:rPr>
+      </w:pPr>
+    </w:p>
+    <w:p>
+      <w:pPr>
+        <w:spacing w:after="0" w:line="240" w:lineRule="auto"/>
+        <w:textAlignment w:val="baseline"/>
+        <w:rPr>
+          <w:rFonts w:ascii="Arial" w:eastAsia="Times New Roman" w:hAnsi="Arial" w:cs="Arial"/>
+          <w:color w:val="000000"/>
+          <w:kern w:val="0"/>
+          <w14:ligatures w14:val="none"/>
+        </w:rPr>
+      </w:pPr>
+      <w:r>
+        <w:rPr>
+          <w:rFonts w:ascii="Arial" w:eastAsia="Times New Roman" w:hAnsi="Arial" w:cs="Arial"/>
+          <w:color w:val="000000"/>
+          <w:kern w:val="0"/>
+          <w14:ligatures w14:val="none"/>
+        </w:rPr>
+        <w:t>I found that having a conversation on topics related to faith with an AI provide</w:t>
+      </w:r>
+      <w:r>
+        <w:rPr>
+          <w:rFonts w:ascii="Arial" w:eastAsia="Times New Roman" w:hAnsi="Arial" w:cs="Arial"/>
+          <w:color w:val="000000"/>
+          <w:kern w:val="0"/>
+          <w14:ligatures w14:val="none"/>
+        </w:rPr>
+        <w:t>d</w:t>
+      </w:r>
+      <w:r>
+        <w:rPr>
+          <w:rFonts w:ascii="Arial" w:eastAsia="Times New Roman" w:hAnsi="Arial" w:cs="Arial"/>
+          <w:color w:val="000000"/>
+          <w:kern w:val="0"/>
+          <w14:ligatures w14:val="none"/>
+        </w:rPr>
+        <w:t xml:space="preserve"> an interesting opportunity to discuss multiple points of view on the same question just by telling the AI what persona it should use.  I tried the following personas to see how the AIs responses changed and kept some of the more interesting responses (see Appendix):</w:t>
+      </w:r>
+    </w:p>
+    <w:p>
+      <w:pPr>
+        <w:spacing w:after="0" w:line="240" w:lineRule="auto"/>
+        <w:textAlignment w:val="baseline"/>
+        <w:rPr>
+          <w:rFonts w:ascii="Arial" w:eastAsia="Times New Roman" w:hAnsi="Arial" w:cs="Arial"/>
+          <w:color w:val="000000"/>
+          <w:kern w:val="0"/>
+          <w14:ligatures w14:val="none"/>
+        </w:rPr>
+      </w:pPr>
+    </w:p>
+    <w:p>
+      <w:pPr>
+        <w:pStyle w:val="ListParagraph"/>
         <w:numPr>
           <w:ilvl w:val="0"/>
-          <w:numId w:val="12"/>
-        </w:numPr>
-        <w:spacing w:before="240" w:after="0" w:line="240" w:lineRule="auto"/>
-        <w:textAlignment w:val="baseline"/>
-        <w:rPr>
-          <w:rFonts w:ascii="Arial" w:eastAsia="Times New Roman" w:hAnsi="Arial" w:cs="Arial"/>
-          <w:color w:val="000000"/>
-          <w:kern w:val="0"/>
-          <w14:ligatures w14:val="none"/>
-        </w:rPr>
-      </w:pPr>
-      <w:r>
-        <w:rPr>
-          <w:rFonts w:ascii="Arial" w:eastAsia="Times New Roman" w:hAnsi="Arial" w:cs="Arial"/>
-          <w:b/>
-          <w:bCs/>
-          <w:color w:val="000000"/>
-          <w:kern w:val="0"/>
-          <w14:ligatures w14:val="none"/>
-        </w:rPr>
-        <w:t>Task:</w:t>
-      </w:r>
-      <w:r>
-        <w:rPr>
-          <w:rFonts w:ascii="Arial" w:eastAsia="Times New Roman" w:hAnsi="Arial" w:cs="Arial"/>
-          <w:color w:val="000000"/>
-          <w:kern w:val="0"/>
-          <w14:ligatures w14:val="none"/>
-        </w:rPr>
-        <w:t xml:space="preserve"> Engage </w:t>
-      </w:r>
-      <w:r>
-        <w:rPr>
-          <w:rFonts w:ascii="Arial" w:eastAsia="Times New Roman" w:hAnsi="Arial" w:cs="Arial"/>
-          <w:b/>
-          <w:bCs/>
-          <w:color w:val="000000"/>
-          <w:kern w:val="0"/>
-          <w14:ligatures w14:val="none"/>
-        </w:rPr>
-        <w:t>three different LLMs</w:t>
-      </w:r>
-      <w:r>
-        <w:rPr>
-          <w:rFonts w:ascii="Arial" w:eastAsia="Times New Roman" w:hAnsi="Arial" w:cs="Arial"/>
-          <w:color w:val="000000"/>
-          <w:kern w:val="0"/>
-          <w14:ligatures w14:val="none"/>
-        </w:rPr>
-        <w:t xml:space="preserve"> using your Part 1 questions. Ask questions and create a </w:t>
-      </w:r>
-      <w:r>
-        <w:rPr>
-          <w:rFonts w:ascii="Arial" w:eastAsia="Times New Roman" w:hAnsi="Arial" w:cs="Arial"/>
-          <w:b/>
-          <w:bCs/>
-          <w:color w:val="000000"/>
-          <w:kern w:val="0"/>
-          <w14:ligatures w14:val="none"/>
-        </w:rPr>
-        <w:t>conversation</w:t>
-      </w:r>
-      <w:r>
-        <w:rPr>
-          <w:rFonts w:ascii="Arial" w:eastAsia="Times New Roman" w:hAnsi="Arial" w:cs="Arial"/>
-          <w:color w:val="000000"/>
-          <w:kern w:val="0"/>
-          <w14:ligatures w14:val="none"/>
-        </w:rPr>
-        <w:t xml:space="preserve"> (ask for clarification, push back, explore alternative theological or </w:t>
-      </w:r>
-      <w:r>
-        <w:rPr>
-          <w:rFonts w:ascii="Arial" w:eastAsia="Times New Roman" w:hAnsi="Arial" w:cs="Arial"/>
-          <w:color w:val="000000"/>
-          <w:kern w:val="0"/>
-          <w14:ligatures w14:val="none"/>
-        </w:rPr>
-        <w:lastRenderedPageBreak/>
-        <w:t xml:space="preserve">philosophical positions). Try to </w:t>
-      </w:r>
-      <w:r>
-        <w:rPr>
-          <w:rFonts w:ascii="Arial" w:eastAsia="Times New Roman" w:hAnsi="Arial" w:cs="Arial"/>
-          <w:b/>
-          <w:bCs/>
-          <w:color w:val="000000"/>
-          <w:kern w:val="0"/>
-          <w14:ligatures w14:val="none"/>
-        </w:rPr>
-        <w:t>push the limits</w:t>
-      </w:r>
-      <w:r>
-        <w:rPr>
-          <w:rFonts w:ascii="Arial" w:eastAsia="Times New Roman" w:hAnsi="Arial" w:cs="Arial"/>
-          <w:color w:val="000000"/>
-          <w:kern w:val="0"/>
-          <w14:ligatures w14:val="none"/>
-        </w:rPr>
-        <w:t xml:space="preserve"> of what these AI systems can do.</w:t>
-      </w:r>
-      <w:r>
-        <w:rPr>
-          <w:rFonts w:ascii="Arial" w:eastAsia="Times New Roman" w:hAnsi="Arial" w:cs="Arial"/>
-          <w:color w:val="000000"/>
-          <w:kern w:val="0"/>
-          <w14:ligatures w14:val="none"/>
-        </w:rPr>
-        <w:br/>
-      </w:r>
-      <w:r>
-        <w:rPr>
-          <w:rFonts w:ascii="Arial" w:eastAsia="Times New Roman" w:hAnsi="Arial" w:cs="Arial"/>
-          <w:color w:val="000000"/>
-          <w:kern w:val="0"/>
-          <w14:ligatures w14:val="none"/>
-        </w:rPr>
-        <w:br/>
-      </w:r>
-    </w:p>
-    <w:p>
-      <w:pPr>
-        <w:numPr>
-          <w:ilvl w:val="0"/>
-          <w:numId w:val="12"/>
+          <w:numId w:val="18"/>
         </w:numPr>
         <w:spacing w:after="0" w:line="240" w:lineRule="auto"/>
         <w:textAlignment w:val="baseline"/>
@@ -559,67 +678,19 @@
       <w:r>
         <w:rPr>
           <w:rFonts w:ascii="Arial" w:eastAsia="Times New Roman" w:hAnsi="Arial" w:cs="Arial"/>
-          <w:b/>
-          <w:bCs/>
-          <w:color w:val="000000"/>
-          <w:kern w:val="0"/>
-          <w14:ligatures w14:val="none"/>
-        </w:rPr>
-        <w:t>Reflection:</w:t>
-      </w:r>
-      <w:r>
-        <w:rPr>
-          <w:rFonts w:ascii="Arial" w:eastAsia="Times New Roman" w:hAnsi="Arial" w:cs="Arial"/>
-          <w:color w:val="000000"/>
-          <w:kern w:val="0"/>
-          <w14:ligatures w14:val="none"/>
-        </w:rPr>
-        <w:t xml:space="preserve"> Write </w:t>
-      </w:r>
-      <w:r>
-        <w:rPr>
-          <w:rFonts w:ascii="Arial" w:eastAsia="Times New Roman" w:hAnsi="Arial" w:cs="Arial"/>
-          <w:b/>
-          <w:bCs/>
-          <w:color w:val="000000"/>
-          <w:kern w:val="0"/>
-          <w14:ligatures w14:val="none"/>
-        </w:rPr>
-        <w:t>250–500 words</w:t>
-      </w:r>
-      <w:r>
-        <w:rPr>
-          <w:rFonts w:ascii="Arial" w:eastAsia="Times New Roman" w:hAnsi="Arial" w:cs="Arial"/>
-          <w:color w:val="000000"/>
-          <w:kern w:val="0"/>
-          <w14:ligatures w14:val="none"/>
-        </w:rPr>
-        <w:t xml:space="preserve"> addressing:</w:t>
-      </w:r>
-      <w:r>
-        <w:rPr>
-          <w:rFonts w:ascii="Arial" w:eastAsia="Times New Roman" w:hAnsi="Arial" w:cs="Arial"/>
-          <w:color w:val="000000"/>
-          <w:kern w:val="0"/>
-          <w14:ligatures w14:val="none"/>
-        </w:rPr>
-        <w:br/>
-      </w:r>
-      <w:r>
-        <w:rPr>
-          <w:rFonts w:ascii="Arial" w:eastAsia="Times New Roman" w:hAnsi="Arial" w:cs="Arial"/>
-          <w:color w:val="000000"/>
-          <w:kern w:val="0"/>
-          <w14:ligatures w14:val="none"/>
-        </w:rPr>
-        <w:br/>
-      </w:r>
-    </w:p>
-    <w:p>
-      <w:pPr>
+          <w:color w:val="000000"/>
+          <w:kern w:val="0"/>
+          <w14:ligatures w14:val="none"/>
+        </w:rPr>
+        <w:t>Person with no religious background</w:t>
+      </w:r>
+    </w:p>
+    <w:p>
+      <w:pPr>
+        <w:pStyle w:val="ListParagraph"/>
         <w:numPr>
-          <w:ilvl w:val="1"/>
-          <w:numId w:val="12"/>
+          <w:ilvl w:val="0"/>
+          <w:numId w:val="18"/>
         </w:numPr>
         <w:spacing w:after="0" w:line="240" w:lineRule="auto"/>
         <w:textAlignment w:val="baseline"/>
@@ -637,14 +708,15 @@
           <w:kern w:val="0"/>
           <w14:ligatures w14:val="none"/>
         </w:rPr>
-        <w:t>Did it feel like a “conversation”?</w:t>
-      </w:r>
-    </w:p>
-    <w:p>
-      <w:pPr>
+        <w:t>Person with a religious background</w:t>
+      </w:r>
+    </w:p>
+    <w:p>
+      <w:pPr>
+        <w:pStyle w:val="ListParagraph"/>
         <w:numPr>
-          <w:ilvl w:val="1"/>
-          <w:numId w:val="12"/>
+          <w:ilvl w:val="0"/>
+          <w:numId w:val="18"/>
         </w:numPr>
         <w:spacing w:after="0" w:line="240" w:lineRule="auto"/>
         <w:textAlignment w:val="baseline"/>
@@ -662,14 +734,15 @@
           <w:kern w:val="0"/>
           <w14:ligatures w14:val="none"/>
         </w:rPr>
-        <w:t>How conversant was the AI with your questions?</w:t>
-      </w:r>
-    </w:p>
-    <w:p>
-      <w:pPr>
+        <w:t>Secular historian who studies religions</w:t>
+      </w:r>
+    </w:p>
+    <w:p>
+      <w:pPr>
+        <w:pStyle w:val="ListParagraph"/>
         <w:numPr>
-          <w:ilvl w:val="1"/>
-          <w:numId w:val="12"/>
+          <w:ilvl w:val="0"/>
+          <w:numId w:val="18"/>
         </w:numPr>
         <w:spacing w:after="0" w:line="240" w:lineRule="auto"/>
         <w:textAlignment w:val="baseline"/>
@@ -687,15 +760,34 @@
           <w:kern w:val="0"/>
           <w14:ligatures w14:val="none"/>
         </w:rPr>
-        <w:t>How did it feel “talking” about faith with AI?</w:t>
-      </w:r>
-    </w:p>
-    <w:p>
-      <w:pPr>
-        <w:numPr>
-          <w:ilvl w:val="1"/>
-          <w:numId w:val="12"/>
-        </w:numPr>
+        <w:t>Person of faith</w:t>
+      </w:r>
+      <w:r>
+        <w:rPr>
+          <w:rFonts w:ascii="Arial" w:eastAsia="Times New Roman" w:hAnsi="Arial" w:cs="Arial"/>
+          <w:color w:val="000000"/>
+          <w:kern w:val="0"/>
+          <w14:ligatures w14:val="none"/>
+        </w:rPr>
+        <w:t xml:space="preserve"> </w:t>
+      </w:r>
+    </w:p>
+    <w:p>
+      <w:pPr>
+        <w:pStyle w:val="ListParagraph"/>
+        <w:spacing w:after="0" w:line="240" w:lineRule="auto"/>
+        <w:ind w:left="1440"/>
+        <w:textAlignment w:val="baseline"/>
+        <w:rPr>
+          <w:rFonts w:ascii="Arial" w:eastAsia="Times New Roman" w:hAnsi="Arial" w:cs="Arial"/>
+          <w:color w:val="000000"/>
+          <w:kern w:val="0"/>
+          <w14:ligatures w14:val="none"/>
+        </w:rPr>
+      </w:pPr>
+    </w:p>
+    <w:p>
+      <w:pPr>
         <w:spacing w:after="0" w:line="240" w:lineRule="auto"/>
         <w:textAlignment w:val="baseline"/>
         <w:rPr>
@@ -712,7 +804,164 @@
           <w:kern w:val="0"/>
           <w14:ligatures w14:val="none"/>
         </w:rPr>
-        <w:t>Did any models seem evasive or avoid sensitive religious topics</w:t>
+        <w:t xml:space="preserve">I found the models that had the longest context window or “memory” had a more natural conversational feel.  The Llama 4 model had a hard time staying on the central topic as occasional side conversations occurred. I also found that all the models were too verbose in their default response for </w:t>
+      </w:r>
+      <w:r>
+        <w:rPr>
+          <w:rFonts w:ascii="Arial" w:eastAsia="Times New Roman" w:hAnsi="Arial" w:cs="Arial"/>
+          <w:color w:val="000000"/>
+          <w:kern w:val="0"/>
+          <w14:ligatures w14:val="none"/>
+        </w:rPr>
+        <w:t xml:space="preserve">the interaction </w:t>
+      </w:r>
+      <w:r>
+        <w:rPr>
+          <w:rFonts w:ascii="Arial" w:eastAsia="Times New Roman" w:hAnsi="Arial" w:cs="Arial"/>
+          <w:color w:val="000000"/>
+          <w:kern w:val="0"/>
+          <w14:ligatures w14:val="none"/>
+        </w:rPr>
+        <w:t xml:space="preserve">to really feel </w:t>
+      </w:r>
+      <w:r>
+        <w:rPr>
+          <w:rFonts w:ascii="Arial" w:eastAsia="Times New Roman" w:hAnsi="Arial" w:cs="Arial"/>
+          <w:color w:val="000000"/>
+          <w:kern w:val="0"/>
+          <w14:ligatures w14:val="none"/>
+        </w:rPr>
+        <w:t xml:space="preserve">like a </w:t>
+      </w:r>
+      <w:r>
+        <w:rPr>
+          <w:rFonts w:ascii="Arial" w:eastAsia="Times New Roman" w:hAnsi="Arial" w:cs="Arial"/>
+          <w:color w:val="000000"/>
+          <w:kern w:val="0"/>
+          <w14:ligatures w14:val="none"/>
+        </w:rPr>
+        <w:t xml:space="preserve">conversation.  When I </w:t>
+      </w:r>
+      <w:r>
+        <w:rPr>
+          <w:rFonts w:ascii="Arial" w:eastAsia="Times New Roman" w:hAnsi="Arial" w:cs="Arial"/>
+          <w:color w:val="000000"/>
+          <w:kern w:val="0"/>
+          <w14:ligatures w14:val="none"/>
+        </w:rPr>
+        <w:t xml:space="preserve">instructed the AIs </w:t>
+      </w:r>
+      <w:r>
+        <w:rPr>
+          <w:rFonts w:ascii="Arial" w:eastAsia="Times New Roman" w:hAnsi="Arial" w:cs="Arial"/>
+          <w:color w:val="000000"/>
+          <w:kern w:val="0"/>
+          <w14:ligatures w14:val="none"/>
+        </w:rPr>
+        <w:t>to limit their response to fewer words, the “conversation” flowed better</w:t>
+      </w:r>
+      <w:r>
+        <w:rPr>
+          <w:rFonts w:ascii="Arial" w:eastAsia="Times New Roman" w:hAnsi="Arial" w:cs="Arial"/>
+          <w:color w:val="000000"/>
+          <w:kern w:val="0"/>
+          <w14:ligatures w14:val="none"/>
+        </w:rPr>
+        <w:t>, but for complex responses like question 5, Llama</w:t>
+      </w:r>
+      <w:r>
+        <w:rPr>
+          <w:rFonts w:ascii="Arial" w:eastAsia="Times New Roman" w:hAnsi="Arial" w:cs="Arial"/>
+          <w:color w:val="000000"/>
+          <w:kern w:val="0"/>
+          <w14:ligatures w14:val="none"/>
+        </w:rPr>
+        <w:t>’s response didn’t make sense.  When I allowed the models to respond with as many words as they wanted, Llama’s response was much shorter</w:t>
+      </w:r>
+      <w:r>
+        <w:rPr>
+          <w:rFonts w:ascii="Arial" w:eastAsia="Times New Roman" w:hAnsi="Arial" w:cs="Arial"/>
+          <w:color w:val="000000"/>
+          <w:kern w:val="0"/>
+          <w14:ligatures w14:val="none"/>
+        </w:rPr>
+        <w:t>.  An interesting difference between Llama and the other models, was that the Llama model reference</w:t>
+      </w:r>
+      <w:r>
+        <w:rPr>
+          <w:rFonts w:ascii="Arial" w:eastAsia="Times New Roman" w:hAnsi="Arial" w:cs="Arial"/>
+          <w:color w:val="000000"/>
+          <w:kern w:val="0"/>
+          <w14:ligatures w14:val="none"/>
+        </w:rPr>
+        <w:t>d</w:t>
+      </w:r>
+      <w:r>
+        <w:rPr>
+          <w:rFonts w:ascii="Arial" w:eastAsia="Times New Roman" w:hAnsi="Arial" w:cs="Arial"/>
+          <w:color w:val="000000"/>
+          <w:kern w:val="0"/>
+          <w14:ligatures w14:val="none"/>
+        </w:rPr>
+        <w:t xml:space="preserve"> Bible verses when the persona was a person of faith or a religious background.  The Christian faith was assumed by Llama even though I didn’t specify any specific faith.  The other models seemed to avoid directly referencing scriptures </w:t>
+      </w:r>
+      <w:r>
+        <w:rPr>
+          <w:rFonts w:ascii="Arial" w:eastAsia="Times New Roman" w:hAnsi="Arial" w:cs="Arial"/>
+          <w:color w:val="000000"/>
+          <w:kern w:val="0"/>
+          <w14:ligatures w14:val="none"/>
+        </w:rPr>
+        <w:t xml:space="preserve">passages </w:t>
+      </w:r>
+      <w:r>
+        <w:rPr>
+          <w:rFonts w:ascii="Arial" w:eastAsia="Times New Roman" w:hAnsi="Arial" w:cs="Arial"/>
+          <w:color w:val="000000"/>
+          <w:kern w:val="0"/>
+          <w14:ligatures w14:val="none"/>
+        </w:rPr>
+        <w:t>even when the persona specified naturally would have</w:t>
+      </w:r>
+      <w:r>
+        <w:rPr>
+          <w:rFonts w:ascii="Arial" w:eastAsia="Times New Roman" w:hAnsi="Arial" w:cs="Arial"/>
+          <w:color w:val="000000"/>
+          <w:kern w:val="0"/>
+          <w14:ligatures w14:val="none"/>
+        </w:rPr>
+        <w:t xml:space="preserve"> used some religious text</w:t>
+      </w:r>
+      <w:r>
+        <w:rPr>
+          <w:rFonts w:ascii="Arial" w:eastAsia="Times New Roman" w:hAnsi="Arial" w:cs="Arial"/>
+          <w:color w:val="000000"/>
+          <w:kern w:val="0"/>
+          <w14:ligatures w14:val="none"/>
+        </w:rPr>
+        <w:t xml:space="preserve">.  Maybe they didn’t know what faith tradition to use so to avoid offense, they didn’t use </w:t>
+      </w:r>
+      <w:r>
+        <w:rPr>
+          <w:rFonts w:ascii="Arial" w:eastAsia="Times New Roman" w:hAnsi="Arial" w:cs="Arial"/>
+          <w:color w:val="000000"/>
+          <w:kern w:val="0"/>
+          <w14:ligatures w14:val="none"/>
+        </w:rPr>
+        <w:t>any religious text.  Another odd thing about Llama’s responses was the inclusion of the mathematical formulas for probability, which doesn’t really fit any of the personas, and fails to feel like a conversation.  The GPT and Gemini models were more naturally conversational overall.</w:t>
+      </w:r>
+    </w:p>
+    <w:p>
+      <w:pPr>
+        <w:rPr>
+          <w:rFonts w:eastAsiaTheme="majorEastAsia"/>
+          <w:color w:val="2F5496" w:themeColor="accent1" w:themeShade="BF"/>
+          <w:sz w:val="40"/>
+          <w:szCs w:val="40"/>
+        </w:rPr>
+      </w:pPr>
+      <w:r>
+        <w:br w:type="page"/>
       </w:r>
     </w:p>
     <w:p>
@@ -726,6 +975,7 @@
         <w:rPr>
           <w:rFonts w:asciiTheme="minorHAnsi" w:hAnsiTheme="minorHAnsi" w:cstheme="minorBidi"/>
         </w:rPr>
+        <w:lastRenderedPageBreak/>
         <w:t xml:space="preserve">Part </w:t>
       </w:r>
       <w:r>
@@ -1197,7 +1447,615 @@
         <w:t>Submit one PDF with Parts 1-3 to the “Module 7 Assignment Reflection Submission” Assignment link. Please document your word count for each section within the PDF.</w:t>
       </w:r>
     </w:p>
+    <w:p>
+      <w:r>
+        <w:br w:type="page"/>
+      </w:r>
+    </w:p>
+    <w:p>
+      <w:pPr>
+        <w:jc w:val="center"/>
+      </w:pPr>
+      <w:r>
+        <w:lastRenderedPageBreak/>
+        <w:t>Appendix</w:t>
+      </w:r>
+    </w:p>
+    <w:p>
+      <w:pPr>
+        <w:jc w:val="center"/>
+      </w:pPr>
+      <w:r>
+        <w:t>AI Faith Interview Response Comparison</w:t>
+      </w:r>
+    </w:p>
+    <w:p>
+      <w:r>
+        <w:t>Question 1 AI Response</w:t>
+      </w:r>
+    </w:p>
+    <w:p>
+      <w:r>
+        <w:drawing>
+          <wp:inline distT="0" distB="0" distL="0" distR="0" wp14:anchorId="5DDE232A" wp14:editId="1867268A">
+            <wp:extent cx="5943600" cy="2922905"/>
+            <wp:effectExtent l="0" t="0" r="0" b="0"/>
+            <wp:docPr id="934597260" name="Picture 1"/>
+            <wp:cNvGraphicFramePr>
+              <a:graphicFrameLocks xmlns:a="http://schemas.openxmlformats.org/drawingml/2006/main" noChangeAspect="1"/>
+            </wp:cNvGraphicFramePr>
+            <a:graphic xmlns:a="http://schemas.openxmlformats.org/drawingml/2006/main">
+              <a:graphicData uri="http://schemas.openxmlformats.org/drawingml/2006/picture">
+                <pic:pic xmlns:pic="http://schemas.openxmlformats.org/drawingml/2006/picture">
+                  <pic:nvPicPr>
+                    <pic:cNvPr id="934597260" name=""/>
+                    <pic:cNvPicPr/>
+                  </pic:nvPicPr>
+                  <pic:blipFill>
+                    <a:blip r:embed="rId6"/>
+                    <a:stretch>
+                      <a:fillRect/>
+                    </a:stretch>
+                  </pic:blipFill>
+                  <pic:spPr>
+                    <a:xfrm>
+                      <a:off x="0" y="0"/>
+                      <a:ext cx="5943600" cy="2922905"/>
+                    </a:xfrm>
+                    <a:prstGeom prst="rect">
+                      <a:avLst/>
+                    </a:prstGeom>
+                  </pic:spPr>
+                </pic:pic>
+              </a:graphicData>
+            </a:graphic>
+          </wp:inline>
+        </w:drawing>
+      </w:r>
+    </w:p>
     <w:p/>
+    <w:p>
+      <w:r>
+        <w:t>Question 2 AI Response</w:t>
+      </w:r>
+    </w:p>
+    <w:p>
+      <w:r>
+        <w:drawing>
+          <wp:inline distT="0" distB="0" distL="0" distR="0" wp14:anchorId="2390F743" wp14:editId="0A13A75C">
+            <wp:extent cx="5943600" cy="2908300"/>
+            <wp:effectExtent l="0" t="0" r="0" b="6350"/>
+            <wp:docPr id="1459807617" name="Picture 1"/>
+            <wp:cNvGraphicFramePr>
+              <a:graphicFrameLocks xmlns:a="http://schemas.openxmlformats.org/drawingml/2006/main" noChangeAspect="1"/>
+            </wp:cNvGraphicFramePr>
+            <a:graphic xmlns:a="http://schemas.openxmlformats.org/drawingml/2006/main">
+              <a:graphicData uri="http://schemas.openxmlformats.org/drawingml/2006/picture">
+                <pic:pic xmlns:pic="http://schemas.openxmlformats.org/drawingml/2006/picture">
+                  <pic:nvPicPr>
+                    <pic:cNvPr id="1459807617" name=""/>
+                    <pic:cNvPicPr/>
+                  </pic:nvPicPr>
+                  <pic:blipFill>
+                    <a:blip r:embed="rId7"/>
+                    <a:stretch>
+                      <a:fillRect/>
+                    </a:stretch>
+                  </pic:blipFill>
+                  <pic:spPr>
+                    <a:xfrm>
+                      <a:off x="0" y="0"/>
+                      <a:ext cx="5943600" cy="2908300"/>
+                    </a:xfrm>
+                    <a:prstGeom prst="rect">
+                      <a:avLst/>
+                    </a:prstGeom>
+                  </pic:spPr>
+                </pic:pic>
+              </a:graphicData>
+            </a:graphic>
+          </wp:inline>
+        </w:drawing>
+      </w:r>
+    </w:p>
+    <w:p/>
+    <w:p>
+      <w:r>
+        <w:br w:type="page"/>
+      </w:r>
+    </w:p>
+    <w:p>
+      <w:r>
+        <w:lastRenderedPageBreak/>
+        <w:t xml:space="preserve">Question </w:t>
+      </w:r>
+      <w:r>
+        <w:t>3</w:t>
+      </w:r>
+      <w:r>
+        <w:t xml:space="preserve"> AI Response</w:t>
+      </w:r>
+    </w:p>
+    <w:p>
+      <w:r>
+        <w:drawing>
+          <wp:inline distT="0" distB="0" distL="0" distR="0" wp14:anchorId="3127EB61" wp14:editId="0291A03D">
+            <wp:extent cx="5943600" cy="2931795"/>
+            <wp:effectExtent l="0" t="0" r="0" b="1905"/>
+            <wp:docPr id="1116089085" name="Picture 1"/>
+            <wp:cNvGraphicFramePr>
+              <a:graphicFrameLocks xmlns:a="http://schemas.openxmlformats.org/drawingml/2006/main" noChangeAspect="1"/>
+            </wp:cNvGraphicFramePr>
+            <a:graphic xmlns:a="http://schemas.openxmlformats.org/drawingml/2006/main">
+              <a:graphicData uri="http://schemas.openxmlformats.org/drawingml/2006/picture">
+                <pic:pic xmlns:pic="http://schemas.openxmlformats.org/drawingml/2006/picture">
+                  <pic:nvPicPr>
+                    <pic:cNvPr id="1116089085" name=""/>
+                    <pic:cNvPicPr/>
+                  </pic:nvPicPr>
+                  <pic:blipFill>
+                    <a:blip r:embed="rId8"/>
+                    <a:stretch>
+                      <a:fillRect/>
+                    </a:stretch>
+                  </pic:blipFill>
+                  <pic:spPr>
+                    <a:xfrm>
+                      <a:off x="0" y="0"/>
+                      <a:ext cx="5943600" cy="2931795"/>
+                    </a:xfrm>
+                    <a:prstGeom prst="rect">
+                      <a:avLst/>
+                    </a:prstGeom>
+                  </pic:spPr>
+                </pic:pic>
+              </a:graphicData>
+            </a:graphic>
+          </wp:inline>
+        </w:drawing>
+      </w:r>
+    </w:p>
+    <w:p>
+      <w:r>
+        <w:t xml:space="preserve">Question </w:t>
+      </w:r>
+      <w:r>
+        <w:t>4</w:t>
+      </w:r>
+      <w:r>
+        <w:t xml:space="preserve"> AI Response</w:t>
+      </w:r>
+    </w:p>
+    <w:p>
+      <w:r>
+        <w:drawing>
+          <wp:inline distT="0" distB="0" distL="0" distR="0" wp14:anchorId="3F0E10C3" wp14:editId="21708526">
+            <wp:extent cx="5943600" cy="2910840"/>
+            <wp:effectExtent l="0" t="0" r="0" b="3810"/>
+            <wp:docPr id="848063259" name="Picture 1"/>
+            <wp:cNvGraphicFramePr>
+              <a:graphicFrameLocks xmlns:a="http://schemas.openxmlformats.org/drawingml/2006/main" noChangeAspect="1"/>
+            </wp:cNvGraphicFramePr>
+            <a:graphic xmlns:a="http://schemas.openxmlformats.org/drawingml/2006/main">
+              <a:graphicData uri="http://schemas.openxmlformats.org/drawingml/2006/picture">
+                <pic:pic xmlns:pic="http://schemas.openxmlformats.org/drawingml/2006/picture">
+                  <pic:nvPicPr>
+                    <pic:cNvPr id="848063259" name=""/>
+                    <pic:cNvPicPr/>
+                  </pic:nvPicPr>
+                  <pic:blipFill>
+                    <a:blip r:embed="rId9"/>
+                    <a:stretch>
+                      <a:fillRect/>
+                    </a:stretch>
+                  </pic:blipFill>
+                  <pic:spPr>
+                    <a:xfrm>
+                      <a:off x="0" y="0"/>
+                      <a:ext cx="5943600" cy="2910840"/>
+                    </a:xfrm>
+                    <a:prstGeom prst="rect">
+                      <a:avLst/>
+                    </a:prstGeom>
+                  </pic:spPr>
+                </pic:pic>
+              </a:graphicData>
+            </a:graphic>
+          </wp:inline>
+        </w:drawing>
+      </w:r>
+    </w:p>
+    <w:p/>
+    <w:p>
+      <w:r>
+        <w:br w:type="page"/>
+      </w:r>
+    </w:p>
+    <w:p>
+      <w:r>
+        <w:lastRenderedPageBreak/>
+        <w:t xml:space="preserve">Question </w:t>
+      </w:r>
+      <w:r>
+        <w:t>5</w:t>
+      </w:r>
+      <w:r>
+        <w:t xml:space="preserve"> AI Response</w:t>
+      </w:r>
+      <w:r>
+        <w:t xml:space="preserve"> - </w:t>
+      </w:r>
+      <w:r>
+        <w:t>Limited to 200 words</w:t>
+      </w:r>
+    </w:p>
+    <w:p>
+      <w:r>
+        <w:drawing>
+          <wp:inline distT="0" distB="0" distL="0" distR="0" wp14:anchorId="146DE1C1" wp14:editId="760D6E13">
+            <wp:extent cx="5943600" cy="2893060"/>
+            <wp:effectExtent l="0" t="0" r="0" b="2540"/>
+            <wp:docPr id="843344106" name="Picture 1"/>
+            <wp:cNvGraphicFramePr>
+              <a:graphicFrameLocks xmlns:a="http://schemas.openxmlformats.org/drawingml/2006/main" noChangeAspect="1"/>
+            </wp:cNvGraphicFramePr>
+            <a:graphic xmlns:a="http://schemas.openxmlformats.org/drawingml/2006/main">
+              <a:graphicData uri="http://schemas.openxmlformats.org/drawingml/2006/picture">
+                <pic:pic xmlns:pic="http://schemas.openxmlformats.org/drawingml/2006/picture">
+                  <pic:nvPicPr>
+                    <pic:cNvPr id="843344106" name=""/>
+                    <pic:cNvPicPr/>
+                  </pic:nvPicPr>
+                  <pic:blipFill>
+                    <a:blip r:embed="rId10"/>
+                    <a:stretch>
+                      <a:fillRect/>
+                    </a:stretch>
+                  </pic:blipFill>
+                  <pic:spPr>
+                    <a:xfrm>
+                      <a:off x="0" y="0"/>
+                      <a:ext cx="5943600" cy="2893060"/>
+                    </a:xfrm>
+                    <a:prstGeom prst="rect">
+                      <a:avLst/>
+                    </a:prstGeom>
+                  </pic:spPr>
+                </pic:pic>
+              </a:graphicData>
+            </a:graphic>
+          </wp:inline>
+        </w:drawing>
+      </w:r>
+    </w:p>
+    <w:p/>
+    <w:p>
+      <w:r>
+        <w:t>Question 5 AI Response</w:t>
+      </w:r>
+      <w:r>
+        <w:t xml:space="preserve"> – </w:t>
+      </w:r>
+      <w:r>
+        <w:t>Unl</w:t>
+      </w:r>
+      <w:r>
+        <w:t>imited words</w:t>
+      </w:r>
+      <w:r>
+        <w:drawing>
+          <wp:inline distT="0" distB="0" distL="0" distR="0" wp14:anchorId="261A9591" wp14:editId="0A084A00">
+            <wp:extent cx="5943600" cy="2894965"/>
+            <wp:effectExtent l="0" t="0" r="0" b="635"/>
+            <wp:docPr id="449026734" name="Picture 1"/>
+            <wp:cNvGraphicFramePr>
+              <a:graphicFrameLocks xmlns:a="http://schemas.openxmlformats.org/drawingml/2006/main" noChangeAspect="1"/>
+            </wp:cNvGraphicFramePr>
+            <a:graphic xmlns:a="http://schemas.openxmlformats.org/drawingml/2006/main">
+              <a:graphicData uri="http://schemas.openxmlformats.org/drawingml/2006/picture">
+                <pic:pic xmlns:pic="http://schemas.openxmlformats.org/drawingml/2006/picture">
+                  <pic:nvPicPr>
+                    <pic:cNvPr id="449026734" name=""/>
+                    <pic:cNvPicPr/>
+                  </pic:nvPicPr>
+                  <pic:blipFill>
+                    <a:blip r:embed="rId11"/>
+                    <a:stretch>
+                      <a:fillRect/>
+                    </a:stretch>
+                  </pic:blipFill>
+                  <pic:spPr>
+                    <a:xfrm>
+                      <a:off x="0" y="0"/>
+                      <a:ext cx="5943600" cy="2894965"/>
+                    </a:xfrm>
+                    <a:prstGeom prst="rect">
+                      <a:avLst/>
+                    </a:prstGeom>
+                  </pic:spPr>
+                </pic:pic>
+              </a:graphicData>
+            </a:graphic>
+          </wp:inline>
+        </w:drawing>
+      </w:r>
+      <w:r>
+        <w:rPr>
+          <w:noProof/>
+        </w:rPr>
+        <w:t xml:space="preserve"> </w:t>
+      </w:r>
+      <w:r>
+        <w:lastRenderedPageBreak/>
+        <w:drawing>
+          <wp:inline distT="0" distB="0" distL="0" distR="0" wp14:anchorId="66AD445C" wp14:editId="164F5A33">
+            <wp:extent cx="5943600" cy="2912745"/>
+            <wp:effectExtent l="0" t="0" r="0" b="1905"/>
+            <wp:docPr id="1562602015" name="Picture 1"/>
+            <wp:cNvGraphicFramePr>
+              <a:graphicFrameLocks xmlns:a="http://schemas.openxmlformats.org/drawingml/2006/main" noChangeAspect="1"/>
+            </wp:cNvGraphicFramePr>
+            <a:graphic xmlns:a="http://schemas.openxmlformats.org/drawingml/2006/main">
+              <a:graphicData uri="http://schemas.openxmlformats.org/drawingml/2006/picture">
+                <pic:pic xmlns:pic="http://schemas.openxmlformats.org/drawingml/2006/picture">
+                  <pic:nvPicPr>
+                    <pic:cNvPr id="1562602015" name=""/>
+                    <pic:cNvPicPr/>
+                  </pic:nvPicPr>
+                  <pic:blipFill>
+                    <a:blip r:embed="rId12"/>
+                    <a:stretch>
+                      <a:fillRect/>
+                    </a:stretch>
+                  </pic:blipFill>
+                  <pic:spPr>
+                    <a:xfrm>
+                      <a:off x="0" y="0"/>
+                      <a:ext cx="5943600" cy="2912745"/>
+                    </a:xfrm>
+                    <a:prstGeom prst="rect">
+                      <a:avLst/>
+                    </a:prstGeom>
+                  </pic:spPr>
+                </pic:pic>
+              </a:graphicData>
+            </a:graphic>
+          </wp:inline>
+        </w:drawing>
+      </w:r>
+      <w:r>
+        <w:rPr>
+          <w:noProof/>
+        </w:rPr>
+        <w:t xml:space="preserve"> </w:t>
+      </w:r>
+      <w:r>
+        <w:rPr>
+          <w:noProof/>
+        </w:rPr>
+        <w:drawing>
+          <wp:inline distT="0" distB="0" distL="0" distR="0" wp14:anchorId="584E8A65" wp14:editId="6308610C">
+            <wp:extent cx="5943600" cy="2917825"/>
+            <wp:effectExtent l="0" t="0" r="0" b="0"/>
+            <wp:docPr id="1425373896" name="Picture 1"/>
+            <wp:cNvGraphicFramePr>
+              <a:graphicFrameLocks xmlns:a="http://schemas.openxmlformats.org/drawingml/2006/main" noChangeAspect="1"/>
+            </wp:cNvGraphicFramePr>
+            <a:graphic xmlns:a="http://schemas.openxmlformats.org/drawingml/2006/main">
+              <a:graphicData uri="http://schemas.openxmlformats.org/drawingml/2006/picture">
+                <pic:pic xmlns:pic="http://schemas.openxmlformats.org/drawingml/2006/picture">
+                  <pic:nvPicPr>
+                    <pic:cNvPr id="1425373896" name=""/>
+                    <pic:cNvPicPr/>
+                  </pic:nvPicPr>
+                  <pic:blipFill>
+                    <a:blip r:embed="rId13"/>
+                    <a:stretch>
+                      <a:fillRect/>
+                    </a:stretch>
+                  </pic:blipFill>
+                  <pic:spPr>
+                    <a:xfrm>
+                      <a:off x="0" y="0"/>
+                      <a:ext cx="5943600" cy="2917825"/>
+                    </a:xfrm>
+                    <a:prstGeom prst="rect">
+                      <a:avLst/>
+                    </a:prstGeom>
+                  </pic:spPr>
+                </pic:pic>
+              </a:graphicData>
+            </a:graphic>
+          </wp:inline>
+        </w:drawing>
+      </w:r>
+      <w:r>
+        <w:rPr>
+          <w:noProof/>
+        </w:rPr>
+        <w:t xml:space="preserve"> </w:t>
+      </w:r>
+      <w:r>
+        <w:rPr>
+          <w:noProof/>
+        </w:rPr>
+        <w:lastRenderedPageBreak/>
+        <w:drawing>
+          <wp:inline distT="0" distB="0" distL="0" distR="0" wp14:anchorId="57916843" wp14:editId="19863F73">
+            <wp:extent cx="5943600" cy="2900680"/>
+            <wp:effectExtent l="0" t="0" r="0" b="0"/>
+            <wp:docPr id="378767197" name="Picture 1"/>
+            <wp:cNvGraphicFramePr>
+              <a:graphicFrameLocks xmlns:a="http://schemas.openxmlformats.org/drawingml/2006/main" noChangeAspect="1"/>
+            </wp:cNvGraphicFramePr>
+            <a:graphic xmlns:a="http://schemas.openxmlformats.org/drawingml/2006/main">
+              <a:graphicData uri="http://schemas.openxmlformats.org/drawingml/2006/picture">
+                <pic:pic xmlns:pic="http://schemas.openxmlformats.org/drawingml/2006/picture">
+                  <pic:nvPicPr>
+                    <pic:cNvPr id="378767197" name=""/>
+                    <pic:cNvPicPr/>
+                  </pic:nvPicPr>
+                  <pic:blipFill>
+                    <a:blip r:embed="rId14"/>
+                    <a:stretch>
+                      <a:fillRect/>
+                    </a:stretch>
+                  </pic:blipFill>
+                  <pic:spPr>
+                    <a:xfrm>
+                      <a:off x="0" y="0"/>
+                      <a:ext cx="5943600" cy="2900680"/>
+                    </a:xfrm>
+                    <a:prstGeom prst="rect">
+                      <a:avLst/>
+                    </a:prstGeom>
+                  </pic:spPr>
+                </pic:pic>
+              </a:graphicData>
+            </a:graphic>
+          </wp:inline>
+        </w:drawing>
+      </w:r>
+      <w:r>
+        <w:rPr>
+          <w:noProof/>
+        </w:rPr>
+        <w:t xml:space="preserve"> </w:t>
+      </w:r>
+      <w:r>
+        <w:rPr>
+          <w:noProof/>
+        </w:rPr>
+        <w:drawing>
+          <wp:inline distT="0" distB="0" distL="0" distR="0" wp14:anchorId="7C14AE35" wp14:editId="7EB927F8">
+            <wp:extent cx="5943600" cy="2910840"/>
+            <wp:effectExtent l="0" t="0" r="0" b="3810"/>
+            <wp:docPr id="354518176" name="Picture 1"/>
+            <wp:cNvGraphicFramePr>
+              <a:graphicFrameLocks xmlns:a="http://schemas.openxmlformats.org/drawingml/2006/main" noChangeAspect="1"/>
+            </wp:cNvGraphicFramePr>
+            <a:graphic xmlns:a="http://schemas.openxmlformats.org/drawingml/2006/main">
+              <a:graphicData uri="http://schemas.openxmlformats.org/drawingml/2006/picture">
+                <pic:pic xmlns:pic="http://schemas.openxmlformats.org/drawingml/2006/picture">
+                  <pic:nvPicPr>
+                    <pic:cNvPr id="354518176" name=""/>
+                    <pic:cNvPicPr/>
+                  </pic:nvPicPr>
+                  <pic:blipFill>
+                    <a:blip r:embed="rId15"/>
+                    <a:stretch>
+                      <a:fillRect/>
+                    </a:stretch>
+                  </pic:blipFill>
+                  <pic:spPr>
+                    <a:xfrm>
+                      <a:off x="0" y="0"/>
+                      <a:ext cx="5943600" cy="2910840"/>
+                    </a:xfrm>
+                    <a:prstGeom prst="rect">
+                      <a:avLst/>
+                    </a:prstGeom>
+                  </pic:spPr>
+                </pic:pic>
+              </a:graphicData>
+            </a:graphic>
+          </wp:inline>
+        </w:drawing>
+      </w:r>
+      <w:r>
+        <w:rPr>
+          <w:noProof/>
+        </w:rPr>
+        <w:t xml:space="preserve"> </w:t>
+      </w:r>
+      <w:r>
+        <w:rPr>
+          <w:noProof/>
+        </w:rPr>
+        <w:lastRenderedPageBreak/>
+        <w:drawing>
+          <wp:inline distT="0" distB="0" distL="0" distR="0" wp14:anchorId="7E9165C5" wp14:editId="5485EF7C">
+            <wp:extent cx="5943600" cy="2908935"/>
+            <wp:effectExtent l="0" t="0" r="0" b="5715"/>
+            <wp:docPr id="1990913409" name="Picture 1"/>
+            <wp:cNvGraphicFramePr>
+              <a:graphicFrameLocks xmlns:a="http://schemas.openxmlformats.org/drawingml/2006/main" noChangeAspect="1"/>
+            </wp:cNvGraphicFramePr>
+            <a:graphic xmlns:a="http://schemas.openxmlformats.org/drawingml/2006/main">
+              <a:graphicData uri="http://schemas.openxmlformats.org/drawingml/2006/picture">
+                <pic:pic xmlns:pic="http://schemas.openxmlformats.org/drawingml/2006/picture">
+                  <pic:nvPicPr>
+                    <pic:cNvPr id="1990913409" name=""/>
+                    <pic:cNvPicPr/>
+                  </pic:nvPicPr>
+                  <pic:blipFill>
+                    <a:blip r:embed="rId16"/>
+                    <a:stretch>
+                      <a:fillRect/>
+                    </a:stretch>
+                  </pic:blipFill>
+                  <pic:spPr>
+                    <a:xfrm>
+                      <a:off x="0" y="0"/>
+                      <a:ext cx="5943600" cy="2908935"/>
+                    </a:xfrm>
+                    <a:prstGeom prst="rect">
+                      <a:avLst/>
+                    </a:prstGeom>
+                  </pic:spPr>
+                </pic:pic>
+              </a:graphicData>
+            </a:graphic>
+          </wp:inline>
+        </w:drawing>
+      </w:r>
+      <w:r>
+        <w:rPr>
+          <w:noProof/>
+        </w:rPr>
+        <w:t xml:space="preserve"> </w:t>
+      </w:r>
+      <w:r>
+        <w:rPr>
+          <w:noProof/>
+        </w:rPr>
+        <w:drawing>
+          <wp:inline distT="0" distB="0" distL="0" distR="0" wp14:anchorId="3610FE45" wp14:editId="00A609B4">
+            <wp:extent cx="5943600" cy="2908935"/>
+            <wp:effectExtent l="0" t="0" r="0" b="5715"/>
+            <wp:docPr id="109892498" name="Picture 1"/>
+            <wp:cNvGraphicFramePr>
+              <a:graphicFrameLocks xmlns:a="http://schemas.openxmlformats.org/drawingml/2006/main" noChangeAspect="1"/>
+            </wp:cNvGraphicFramePr>
+            <a:graphic xmlns:a="http://schemas.openxmlformats.org/drawingml/2006/main">
+              <a:graphicData uri="http://schemas.openxmlformats.org/drawingml/2006/picture">
+                <pic:pic xmlns:pic="http://schemas.openxmlformats.org/drawingml/2006/picture">
+                  <pic:nvPicPr>
+                    <pic:cNvPr id="109892498" name=""/>
+                    <pic:cNvPicPr/>
+                  </pic:nvPicPr>
+                  <pic:blipFill>
+                    <a:blip r:embed="rId17"/>
+                    <a:stretch>
+                      <a:fillRect/>
+                    </a:stretch>
+                  </pic:blipFill>
+                  <pic:spPr>
+                    <a:xfrm>
+                      <a:off x="0" y="0"/>
+                      <a:ext cx="5943600" cy="2908935"/>
+                    </a:xfrm>
+                    <a:prstGeom prst="rect">
+                      <a:avLst/>
+                    </a:prstGeom>
+                  </pic:spPr>
+                </pic:pic>
+              </a:graphicData>
+            </a:graphic>
+          </wp:inline>
+        </w:drawing>
+      </w:r>
+    </w:p>
     <w:sectPr>
       <w:pgSz w:w="12240" w:h="15840"/>
       <w:pgMar w:top="1440" w:right="1440" w:bottom="1440" w:left="1440" w:header="720" w:footer="720" w:gutter="0"/>
@@ -2389,6 +3247,119 @@
     </w:lvl>
   </w:abstractNum>
   <w:abstractNum w:abstractNumId="10" w15:restartNumberingAfterBreak="0">
+    <w:nsid w:val="5D194AC2"/>
+    <w:multiLevelType w:val="hybridMultilevel"/>
+    <w:tmpl w:val="6E8446D0"/>
+    <w:lvl w:ilvl="0" w:tplc="04090001">
+      <w:start w:val="1"/>
+      <w:numFmt w:val="bullet"/>
+      <w:lvlText w:val=""/>
+      <w:lvlJc w:val="left"/>
+      <w:pPr>
+        <w:ind w:left="1440" w:hanging="360"/>
+      </w:pPr>
+      <w:rPr>
+        <w:rFonts w:ascii="Symbol" w:hAnsi="Symbol" w:hint="default"/>
+      </w:rPr>
+    </w:lvl>
+    <w:lvl w:ilvl="1" w:tplc="04090003" w:tentative="1">
+      <w:start w:val="1"/>
+      <w:numFmt w:val="bullet"/>
+      <w:lvlText w:val="o"/>
+      <w:lvlJc w:val="left"/>
+      <w:pPr>
+        <w:ind w:left="2160" w:hanging="360"/>
+      </w:pPr>
+      <w:rPr>
+        <w:rFonts w:ascii="Courier New" w:hAnsi="Courier New" w:cs="Courier New" w:hint="default"/>
+      </w:rPr>
+    </w:lvl>
+    <w:lvl w:ilvl="2" w:tplc="04090005" w:tentative="1">
+      <w:start w:val="1"/>
+      <w:numFmt w:val="bullet"/>
+      <w:lvlText w:val=""/>
+      <w:lvlJc w:val="left"/>
+      <w:pPr>
+        <w:ind w:left="2880" w:hanging="360"/>
+      </w:pPr>
+      <w:rPr>
+        <w:rFonts w:ascii="Wingdings" w:hAnsi="Wingdings" w:hint="default"/>
+      </w:rPr>
+    </w:lvl>
+    <w:lvl w:ilvl="3" w:tplc="04090001" w:tentative="1">
+      <w:start w:val="1"/>
+      <w:numFmt w:val="bullet"/>
+      <w:lvlText w:val=""/>
+      <w:lvlJc w:val="left"/>
+      <w:pPr>
+        <w:ind w:left="3600" w:hanging="360"/>
+      </w:pPr>
+      <w:rPr>
+        <w:rFonts w:ascii="Symbol" w:hAnsi="Symbol" w:hint="default"/>
+      </w:rPr>
+    </w:lvl>
+    <w:lvl w:ilvl="4" w:tplc="04090003" w:tentative="1">
+      <w:start w:val="1"/>
+      <w:numFmt w:val="bullet"/>
+      <w:lvlText w:val="o"/>
+      <w:lvlJc w:val="left"/>
+      <w:pPr>
+        <w:ind w:left="4320" w:hanging="360"/>
+      </w:pPr>
+      <w:rPr>
+        <w:rFonts w:ascii="Courier New" w:hAnsi="Courier New" w:cs="Courier New" w:hint="default"/>
+      </w:rPr>
+    </w:lvl>
+    <w:lvl w:ilvl="5" w:tplc="04090005" w:tentative="1">
+      <w:start w:val="1"/>
+      <w:numFmt w:val="bullet"/>
+      <w:lvlText w:val=""/>
+      <w:lvlJc w:val="left"/>
+      <w:pPr>
+        <w:ind w:left="5040" w:hanging="360"/>
+      </w:pPr>
+      <w:rPr>
+        <w:rFonts w:ascii="Wingdings" w:hAnsi="Wingdings" w:hint="default"/>
+      </w:rPr>
+    </w:lvl>
+    <w:lvl w:ilvl="6" w:tplc="04090001" w:tentative="1">
+      <w:start w:val="1"/>
+      <w:numFmt w:val="bullet"/>
+      <w:lvlText w:val=""/>
+      <w:lvlJc w:val="left"/>
+      <w:pPr>
+        <w:ind w:left="5760" w:hanging="360"/>
+      </w:pPr>
+      <w:rPr>
+        <w:rFonts w:ascii="Symbol" w:hAnsi="Symbol" w:hint="default"/>
+      </w:rPr>
+    </w:lvl>
+    <w:lvl w:ilvl="7" w:tplc="04090003" w:tentative="1">
+      <w:start w:val="1"/>
+      <w:numFmt w:val="bullet"/>
+      <w:lvlText w:val="o"/>
+      <w:lvlJc w:val="left"/>
+      <w:pPr>
+        <w:ind w:left="6480" w:hanging="360"/>
+      </w:pPr>
+      <w:rPr>
+        <w:rFonts w:ascii="Courier New" w:hAnsi="Courier New" w:cs="Courier New" w:hint="default"/>
+      </w:rPr>
+    </w:lvl>
+    <w:lvl w:ilvl="8" w:tplc="04090005" w:tentative="1">
+      <w:start w:val="1"/>
+      <w:numFmt w:val="bullet"/>
+      <w:lvlText w:val=""/>
+      <w:lvlJc w:val="left"/>
+      <w:pPr>
+        <w:ind w:left="7200" w:hanging="360"/>
+      </w:pPr>
+      <w:rPr>
+        <w:rFonts w:ascii="Wingdings" w:hAnsi="Wingdings" w:hint="default"/>
+      </w:rPr>
+    </w:lvl>
+  </w:abstractNum>
+  <w:abstractNum w:abstractNumId="11" w15:restartNumberingAfterBreak="0">
     <w:nsid w:val="68106C35"/>
     <w:multiLevelType w:val="hybridMultilevel"/>
     <w:tmpl w:val="5E5A2402"/>
@@ -2501,7 +3472,7 @@
       </w:rPr>
     </w:lvl>
   </w:abstractNum>
-  <w:abstractNum w:abstractNumId="11" w15:restartNumberingAfterBreak="0">
+  <w:abstractNum w:abstractNumId="12" w15:restartNumberingAfterBreak="0">
     <w:nsid w:val="787E4018"/>
     <w:multiLevelType w:val="hybridMultilevel"/>
     <w:tmpl w:val="A66CF6B0"/>
@@ -2614,7 +3585,7 @@
       </w:rPr>
     </w:lvl>
   </w:abstractNum>
-  <w:abstractNum w:abstractNumId="12" w15:restartNumberingAfterBreak="0">
+  <w:abstractNum w:abstractNumId="13" w15:restartNumberingAfterBreak="0">
     <w:nsid w:val="7C7B5D5A"/>
     <w:multiLevelType w:val="multilevel"/>
     <w:tmpl w:val="0F800E16"/>
@@ -2763,7 +3734,7 @@
       </w:rPr>
     </w:lvl>
   </w:abstractNum>
-  <w:abstractNum w:abstractNumId="13" w15:restartNumberingAfterBreak="0">
+  <w:abstractNum w:abstractNumId="14" w15:restartNumberingAfterBreak="0">
     <w:nsid w:val="7D5F0650"/>
     <w:multiLevelType w:val="hybridMultilevel"/>
     <w:tmpl w:val="1B249FB2"/>
@@ -2883,10 +3854,10 @@
     <w:abstractNumId w:val="6"/>
   </w:num>
   <w:num w:numId="3" w16cid:durableId="892498404">
-    <w:abstractNumId w:val="13"/>
+    <w:abstractNumId w:val="14"/>
   </w:num>
   <w:num w:numId="4" w16cid:durableId="975142219">
-    <w:abstractNumId w:val="11"/>
+    <w:abstractNumId w:val="12"/>
   </w:num>
   <w:num w:numId="5" w16cid:durableId="1923491126">
     <w:abstractNumId w:val="5"/>
@@ -2904,10 +3875,10 @@
     <w:abstractNumId w:val="4"/>
   </w:num>
   <w:num w:numId="10" w16cid:durableId="454107797">
-    <w:abstractNumId w:val="10"/>
+    <w:abstractNumId w:val="11"/>
   </w:num>
   <w:num w:numId="11" w16cid:durableId="1323461796">
-    <w:abstractNumId w:val="12"/>
+    <w:abstractNumId w:val="13"/>
   </w:num>
   <w:num w:numId="12" w16cid:durableId="1382709837">
     <w:abstractNumId w:val="2"/>
@@ -2947,6 +3918,9 @@
         <w:lvlJc w:val="left"/>
       </w:lvl>
     </w:lvlOverride>
+  </w:num>
+  <w:num w:numId="18" w16cid:durableId="1071268620">
+    <w:abstractNumId w:val="10"/>
   </w:num>
   <w:numIdMacAtCleanup w:val="10"/>
 </w:numbering>

</xml_diff>